<commit_message>
docs: corregir documento de evidencias de la Parte 3
</commit_message>
<xml_diff>
--- a/Taller Backend 2 - Grupo 6.docx
+++ b/Taller Backend 2 - Grupo 6.docx
@@ -43,7 +43,7 @@
         <w:rPr>
           <w:rtl w:val="0"/>
         </w:rPr>
-        <w:t xml:space="preserve">Parte 2</w:t>
+        <w:t xml:space="preserve">Parte 3</w:t>
       </w:r>
     </w:p>
     <w:p>
@@ -744,7 +744,7 @@
         <w:rPr>
           <w:rtl w:val="0"/>
         </w:rPr>
-        <w:t xml:space="preserve">El puerto del contenedor es el puerto donde la aplicación escucha dentro del contenedor, en este caso el 3000. El puerto publicado es el puerto de nuestra máquina que Docker conecta con el del contenedor, y es por el que entramos desde afuera. Con -p 3000:3000 los dos son el 3000. Si usáramos -p 8081:3000, la app seguiría escuchando en el 3000 dentro del contenedor, pero desde nuestra máquina entraríamos por localhost:8081.Ahora v</w:t>
+        <w:t xml:space="preserve">El puerto del contenedor es el puerto donde la aplicación escucha dentro del contenedor, en este caso el 3000. El puerto publicado es el puerto de nuestra máquina que Docker conecta con el del contenedor, y es por el que entramos desde afuera. Con -p 3000:3000 los dos son el 3000. Si usáramos -p 8081:3000, la app seguiría escuchando en el 3000 dentro del contenedor, pero desde nuestra máquina entraríamos por localhost:8081.</w:t>
       </w:r>
     </w:p>
     <w:sectPr>

</xml_diff>

<commit_message>
feat: README con evidencias y docx completo
</commit_message>
<xml_diff>
--- a/Taller Backend 2 - Grupo 6.docx
+++ b/Taller Backend 2 - Grupo 6.docx
@@ -1,8 +1,20 @@
 
 <file path=word/document.xml><?xml version="1.0" encoding="utf-8"?>
-<w:document xmlns:mc="http://schemas.openxmlformats.org/markup-compatibility/2006" xmlns:o="urn:schemas-microsoft-com:office:office" xmlns:r="http://schemas.openxmlformats.org/officeDocument/2006/relationships" xmlns:m="http://schemas.openxmlformats.org/officeDocument/2006/math" xmlns:v="urn:schemas-microsoft-com:vml" xmlns:wp="http://schemas.openxmlformats.org/drawingml/2006/wordprocessingDrawing" xmlns:w10="urn:schemas-microsoft-com:office:word" xmlns:w="http://schemas.openxmlformats.org/wordprocessingml/2006/main" xmlns:wne="http://schemas.microsoft.com/office/word/2006/wordml" xmlns:sl="http://schemas.openxmlformats.org/schemaLibrary/2006/main" xmlns:a="http://schemas.openxmlformats.org/drawingml/2006/main" xmlns:pic="http://schemas.openxmlformats.org/drawingml/2006/picture" xmlns:c="http://schemas.openxmlformats.org/drawingml/2006/chart" xmlns:lc="http://schemas.openxmlformats.org/drawingml/2006/lockedCanvas" xmlns:dgm="http://schemas.openxmlformats.org/drawingml/2006/diagram" xmlns:wps="http://schemas.microsoft.com/office/word/2010/wordprocessingShape" xmlns:wpg="http://schemas.microsoft.com/office/word/2010/wordprocessingGroup" xmlns:w14="http://schemas.microsoft.com/office/word/2010/wordml" xmlns:w15="http://schemas.microsoft.com/office/word/2012/wordml" xmlns:w16="http://schemas.microsoft.com/office/word/2018/wordml" xmlns:w16cex="http://schemas.microsoft.com/office/word/2018/wordml/cex" xmlns:w16cid="http://schemas.microsoft.com/office/word/2016/wordml/cid" xmlns="http://schemas.microsoft.com/office/tasks/2019/documenttasks" xmlns:cr="http://schemas.microsoft.com/office/comments/2020/reactions">
+<w:document xmlns:wp14="http://schemas.microsoft.com/office/word/2010/wordprocessingDrawing" xmlns:mc="http://schemas.openxmlformats.org/markup-compatibility/2006" xmlns:o="urn:schemas-microsoft-com:office:office" xmlns:r="http://schemas.openxmlformats.org/officeDocument/2006/relationships" xmlns:m="http://schemas.openxmlformats.org/officeDocument/2006/math" xmlns:v="urn:schemas-microsoft-com:vml" xmlns:wp="http://schemas.openxmlformats.org/drawingml/2006/wordprocessingDrawing" xmlns:w10="urn:schemas-microsoft-com:office:word" xmlns:w="http://schemas.openxmlformats.org/wordprocessingml/2006/main" xmlns:wne="http://schemas.microsoft.com/office/word/2006/wordml" xmlns:sl="http://schemas.openxmlformats.org/schemaLibrary/2006/main" xmlns:a="http://schemas.openxmlformats.org/drawingml/2006/main" xmlns:pic="http://schemas.openxmlformats.org/drawingml/2006/picture" xmlns:c="http://schemas.openxmlformats.org/drawingml/2006/chart" xmlns:lc="http://schemas.openxmlformats.org/drawingml/2006/lockedCanvas" xmlns:dgm="http://schemas.openxmlformats.org/drawingml/2006/diagram" xmlns:wps="http://schemas.microsoft.com/office/word/2010/wordprocessingShape" xmlns:wpg="http://schemas.microsoft.com/office/word/2010/wordprocessingGroup" xmlns:w14="http://schemas.microsoft.com/office/word/2010/wordml" xmlns:w15="http://schemas.microsoft.com/office/word/2012/wordml" xmlns:w16="http://schemas.microsoft.com/office/word/2018/wordml" xmlns:w16cex="http://schemas.microsoft.com/office/word/2018/wordml/cex" xmlns:w16cid="http://schemas.microsoft.com/office/word/2016/wordml/cid" xmlns="http://schemas.microsoft.com/office/tasks/2019/documenttasks" xmlns:cr="http://schemas.microsoft.com/office/comments/2020/reactions" xmlns:a14="http://schemas.microsoft.com/office/drawing/2010/main" mc:Ignorable="wp14">
   <w:body>
-    <w:p>
+    <w:p xmlns:wp14="http://schemas.microsoft.com/office/word/2010/wordml" wp14:textId="6D46F41D">
+      <w:pPr>
+        <w:ind w:left="0" w:firstLine="0"/>
+        <w:jc w:val="center"/>
+      </w:pPr>
+      <w:r>
+        <w:rPr>
+          <w:lang w:val="es-ES"/>
+        </w:rPr>
+        <w:t xml:space="preserve">Taller Backend 2 - Grupo 6  </w:t>
+      </w:r>
+    </w:p>
+    <w:p xmlns:wp14="http://schemas.microsoft.com/office/word/2010/wordml" wp14:textId="77777777">
       <w:pPr>
         <w:ind w:left="0" w:firstLine="0"/>
         <w:rPr/>
@@ -11,70 +23,20 @@
         <w:rPr>
           <w:rtl w:val="0"/>
         </w:rPr>
-        <w:t xml:space="preserve">Taller Backend 2 - Grupo 6 </w:t>
-        <w:tab/>
-        <w:tab/>
-        <w:tab/>
-        <w:tab/>
-        <w:tab/>
-        <w:tab/>
-        <w:tab/>
-        <w:tab/>
-        <w:tab/>
-      </w:r>
-    </w:p>
-    <w:p>
-      <w:pPr>
-        <w:ind w:left="0" w:firstLine="0"/>
-        <w:rPr/>
-      </w:pPr>
-      <w:r>
-        <w:rPr>
-          <w:rtl w:val="0"/>
-        </w:rPr>
-      </w:r>
-    </w:p>
-    <w:p>
-      <w:pPr>
-        <w:ind w:left="0" w:firstLine="0"/>
-        <w:rPr/>
-      </w:pPr>
-      <w:r>
-        <w:rPr>
-          <w:rtl w:val="0"/>
-        </w:rPr>
-        <w:t xml:space="preserve">Parte 3</w:t>
-      </w:r>
-    </w:p>
-    <w:p>
-      <w:pPr>
-        <w:ind w:left="0" w:firstLine="0"/>
-        <w:rPr/>
-      </w:pPr>
-      <w:r>
-        <w:rPr>
-          <w:rtl w:val="0"/>
-        </w:rPr>
-      </w:r>
-    </w:p>
-    <w:p>
-      <w:pPr>
-        <w:numPr>
-          <w:ilvl w:val="0"/>
-          <w:numId w:val="1"/>
-        </w:numPr>
+      </w:r>
+    </w:p>
+    <w:p xmlns:wp14="http://schemas.microsoft.com/office/word/2010/wordml" wp14:textId="6F3C1B17">
+      <w:pPr>
         <w:ind w:left="720" w:hanging="360"/>
+      </w:pPr>
+      <w:r>
         <w:rPr>
           <w:u w:val="none"/>
         </w:rPr>
-      </w:pPr>
-      <w:r>
-        <w:rPr>
-          <w:rtl w:val="0"/>
-        </w:rPr>
-      </w:r>
-    </w:p>
-    <w:p>
+        <w:t>Parte 1.</w:t>
+      </w:r>
+    </w:p>
+    <w:p xmlns:wp14="http://schemas.microsoft.com/office/word/2010/wordml" wp14:textId="77777777">
       <w:pPr>
         <w:ind w:left="720" w:firstLine="0"/>
         <w:rPr/>
@@ -82,9 +44,9 @@
       <w:r>
         <w:rPr/>
         <w:drawing>
-          <wp:inline distB="114300" distT="114300" distL="114300" distR="114300">
+          <wp:inline xmlns:wp14="http://schemas.microsoft.com/office/word/2010/wordprocessingDrawing" distT="114300" distB="114300" distL="114300" distR="114300" wp14:anchorId="4A64A8EC" wp14:editId="7777777">
             <wp:extent cx="5731200" cy="889000"/>
-            <wp:effectExtent b="0" l="0" r="0" t="0"/>
+            <wp:effectExtent l="0" t="0" r="0" b="0"/>
             <wp:docPr id="1" name="image1.png"/>
             <a:graphic>
               <a:graphicData uri="http://schemas.openxmlformats.org/drawingml/2006/picture">
@@ -95,7 +57,7 @@
                   </pic:nvPicPr>
                   <pic:blipFill>
                     <a:blip r:embed="rId6"/>
-                    <a:srcRect b="0" l="0" r="0" t="0"/>
+                    <a:srcRect l="0" t="0" r="0" b="0"/>
                     <a:stretch>
                       <a:fillRect/>
                     </a:stretch>
@@ -120,7 +82,7 @@
         </w:rPr>
       </w:r>
     </w:p>
-    <w:p>
+    <w:p xmlns:wp14="http://schemas.microsoft.com/office/word/2010/wordml" wp14:textId="77777777">
       <w:pPr>
         <w:ind w:left="0" w:firstLine="0"/>
         <w:rPr/>
@@ -131,58 +93,49 @@
         </w:rPr>
       </w:r>
     </w:p>
-    <w:p>
-      <w:pPr>
-        <w:numPr>
-          <w:ilvl w:val="0"/>
-          <w:numId w:val="1"/>
-        </w:numPr>
+    <w:p xmlns:wp14="http://schemas.microsoft.com/office/word/2010/wordml" wp14:textId="092EE064">
+      <w:pPr>
         <w:ind w:left="720" w:hanging="360"/>
+      </w:pPr>
+      <w:r>
         <w:rPr>
           <w:u w:val="none"/>
         </w:rPr>
-      </w:pPr>
-      <w:r>
-        <w:rPr>
-          <w:rtl w:val="0"/>
-        </w:rPr>
+        <w:t>Parte 2.</w:t>
       </w:r>
     </w:p>
     <w:tbl>
       <w:tblPr>
         <w:tblStyle w:val="Table1"/>
-        <w:tblW w:w="8309.0" w:type="dxa"/>
+        <w:tblW w:w="8309" w:type="dxa"/>
         <w:jc w:val="left"/>
         <w:tblInd w:w="720.0" w:type="dxa"/>
         <w:tblBorders>
-          <w:top w:color="000000" w:space="0" w:sz="8" w:val="single"/>
-          <w:left w:color="000000" w:space="0" w:sz="8" w:val="single"/>
-          <w:bottom w:color="000000" w:space="0" w:sz="8" w:val="single"/>
-          <w:right w:color="000000" w:space="0" w:sz="8" w:val="single"/>
-          <w:insideH w:color="000000" w:space="0" w:sz="8" w:val="single"/>
-          <w:insideV w:color="000000" w:space="0" w:sz="8" w:val="single"/>
+          <w:top w:val="single" w:color="000000" w:sz="8" w:space="0"/>
+          <w:left w:val="single" w:color="000000" w:sz="8" w:space="0"/>
+          <w:bottom w:val="single" w:color="000000" w:sz="8" w:space="0"/>
+          <w:right w:val="single" w:color="000000" w:sz="8" w:space="0"/>
+          <w:insideH w:val="single" w:color="000000" w:sz="8" w:space="0"/>
+          <w:insideV w:val="single" w:color="000000" w:sz="8" w:space="0"/>
         </w:tblBorders>
         <w:tblLayout w:type="fixed"/>
         <w:tblLook w:val="0600"/>
+        <w:tblPrChange w:author="" w:id="1234144088">
+          <w:tblPr/>
+        </w:tblPrChange>
       </w:tblPr>
       <w:tblGrid>
-        <w:gridCol w:w="4154.5"/>
-        <w:gridCol w:w="4154.5"/>
-        <w:tblGridChange w:id="0">
-          <w:tblGrid>
-            <w:gridCol w:w="4154.5"/>
-            <w:gridCol w:w="4154.5"/>
-          </w:tblGrid>
-        </w:tblGridChange>
+        <w:gridCol w:w="4154"/>
+        <w:gridCol w:w="4154"/>
       </w:tblGrid>
-      <w:tr>
+      <w:tr xmlns:wp14="http://schemas.microsoft.com/office/word/2010/wordml" wp14:textId="77777777">
         <w:trPr>
           <w:cantSplit w:val="0"/>
           <w:tblHeader w:val="0"/>
         </w:trPr>
         <w:tc>
           <w:tcPr>
-            <w:shd w:fill="auto" w:val="clear"/>
+            <w:shd w:val="clear" w:color="auto" w:fill="auto"/>
             <w:tcMar>
               <w:top w:w="100.0" w:type="dxa"/>
               <w:left w:w="100.0" w:type="dxa"/>
@@ -191,21 +144,21 @@
             </w:tcMar>
             <w:vAlign w:val="top"/>
           </w:tcPr>
-          <w:p>
+          <w:p wp14:textId="77777777">
             <w:pPr>
               <w:keepNext w:val="0"/>
               <w:keepLines w:val="0"/>
               <w:pageBreakBefore w:val="0"/>
               <w:widowControl w:val="0"/>
               <w:pBdr>
-                <w:top w:space="0" w:sz="0" w:val="nil"/>
-                <w:left w:space="0" w:sz="0" w:val="nil"/>
-                <w:bottom w:space="0" w:sz="0" w:val="nil"/>
-                <w:right w:space="0" w:sz="0" w:val="nil"/>
-                <w:between w:space="0" w:sz="0" w:val="nil"/>
+                <w:top w:val="nil" w:sz="0" w:space="0"/>
+                <w:left w:val="nil" w:sz="0" w:space="0"/>
+                <w:bottom w:val="nil" w:sz="0" w:space="0"/>
+                <w:right w:val="nil" w:sz="0" w:space="0"/>
+                <w:between w:val="nil" w:sz="0" w:space="0"/>
               </w:pBdr>
-              <w:shd w:fill="auto" w:val="clear"/>
-              <w:spacing w:after="0" w:before="0" w:line="240" w:lineRule="auto"/>
+              <w:shd w:val="clear" w:fill="auto"/>
+              <w:spacing w:before="0" w:after="0" w:line="240" w:lineRule="auto"/>
               <w:ind w:left="0" w:right="0" w:firstLine="0"/>
               <w:jc w:val="left"/>
               <w:rPr/>
@@ -220,7 +173,7 @@
         </w:tc>
         <w:tc>
           <w:tcPr>
-            <w:shd w:fill="auto" w:val="clear"/>
+            <w:shd w:val="clear" w:color="auto" w:fill="auto"/>
             <w:tcMar>
               <w:top w:w="100.0" w:type="dxa"/>
               <w:left w:w="100.0" w:type="dxa"/>
@@ -229,21 +182,21 @@
             </w:tcMar>
             <w:vAlign w:val="top"/>
           </w:tcPr>
-          <w:p>
+          <w:p wp14:textId="77777777">
             <w:pPr>
               <w:keepNext w:val="0"/>
               <w:keepLines w:val="0"/>
               <w:pageBreakBefore w:val="0"/>
               <w:widowControl w:val="0"/>
               <w:pBdr>
-                <w:top w:space="0" w:sz="0" w:val="nil"/>
-                <w:left w:space="0" w:sz="0" w:val="nil"/>
-                <w:bottom w:space="0" w:sz="0" w:val="nil"/>
-                <w:right w:space="0" w:sz="0" w:val="nil"/>
-                <w:between w:space="0" w:sz="0" w:val="nil"/>
+                <w:top w:val="nil" w:sz="0" w:space="0"/>
+                <w:left w:val="nil" w:sz="0" w:space="0"/>
+                <w:bottom w:val="nil" w:sz="0" w:space="0"/>
+                <w:right w:val="nil" w:sz="0" w:space="0"/>
+                <w:between w:val="nil" w:sz="0" w:space="0"/>
               </w:pBdr>
-              <w:shd w:fill="auto" w:val="clear"/>
-              <w:spacing w:after="0" w:before="0" w:line="240" w:lineRule="auto"/>
+              <w:shd w:val="clear" w:fill="auto"/>
+              <w:spacing w:before="0" w:after="0" w:line="240" w:lineRule="auto"/>
               <w:ind w:left="0" w:right="0" w:firstLine="0"/>
               <w:jc w:val="left"/>
               <w:rPr/>
@@ -257,14 +210,14 @@
           </w:p>
         </w:tc>
       </w:tr>
-      <w:tr>
+      <w:tr xmlns:wp14="http://schemas.microsoft.com/office/word/2010/wordml" wp14:textId="77777777">
         <w:trPr>
           <w:cantSplit w:val="0"/>
           <w:tblHeader w:val="0"/>
         </w:trPr>
         <w:tc>
           <w:tcPr>
-            <w:shd w:fill="auto" w:val="clear"/>
+            <w:shd w:val="clear" w:color="auto" w:fill="auto"/>
             <w:tcMar>
               <w:top w:w="100.0" w:type="dxa"/>
               <w:left w:w="100.0" w:type="dxa"/>
@@ -273,21 +226,21 @@
             </w:tcMar>
             <w:vAlign w:val="top"/>
           </w:tcPr>
-          <w:p>
+          <w:p wp14:textId="77777777">
             <w:pPr>
               <w:keepNext w:val="0"/>
               <w:keepLines w:val="0"/>
               <w:pageBreakBefore w:val="0"/>
               <w:widowControl w:val="0"/>
               <w:pBdr>
-                <w:top w:space="0" w:sz="0" w:val="nil"/>
-                <w:left w:space="0" w:sz="0" w:val="nil"/>
-                <w:bottom w:space="0" w:sz="0" w:val="nil"/>
-                <w:right w:space="0" w:sz="0" w:val="nil"/>
-                <w:between w:space="0" w:sz="0" w:val="nil"/>
+                <w:top w:val="nil" w:sz="0" w:space="0"/>
+                <w:left w:val="nil" w:sz="0" w:space="0"/>
+                <w:bottom w:val="nil" w:sz="0" w:space="0"/>
+                <w:right w:val="nil" w:sz="0" w:space="0"/>
+                <w:between w:val="nil" w:sz="0" w:space="0"/>
               </w:pBdr>
-              <w:shd w:fill="auto" w:val="clear"/>
-              <w:spacing w:after="0" w:before="0" w:line="240" w:lineRule="auto"/>
+              <w:shd w:val="clear" w:fill="auto"/>
+              <w:spacing w:before="0" w:after="0" w:line="240" w:lineRule="auto"/>
               <w:ind w:left="0" w:right="0" w:firstLine="0"/>
               <w:jc w:val="left"/>
               <w:rPr/>
@@ -302,7 +255,7 @@
         </w:tc>
         <w:tc>
           <w:tcPr>
-            <w:shd w:fill="auto" w:val="clear"/>
+            <w:shd w:val="clear" w:color="auto" w:fill="auto"/>
             <w:tcMar>
               <w:top w:w="100.0" w:type="dxa"/>
               <w:left w:w="100.0" w:type="dxa"/>
@@ -311,42 +264,41 @@
             </w:tcMar>
             <w:vAlign w:val="top"/>
           </w:tcPr>
-          <w:p>
+          <w:p wp14:textId="77777777">
             <w:pPr>
               <w:keepNext w:val="0"/>
               <w:keepLines w:val="0"/>
               <w:pageBreakBefore w:val="0"/>
               <w:widowControl w:val="0"/>
               <w:pBdr>
-                <w:top w:space="0" w:sz="0" w:val="nil"/>
-                <w:left w:space="0" w:sz="0" w:val="nil"/>
-                <w:bottom w:space="0" w:sz="0" w:val="nil"/>
-                <w:right w:space="0" w:sz="0" w:val="nil"/>
-                <w:between w:space="0" w:sz="0" w:val="nil"/>
+                <w:top w:val="nil" w:color="FF000000" w:sz="0" w:space="0"/>
+                <w:left w:val="nil" w:color="FF000000" w:sz="0" w:space="0"/>
+                <w:bottom w:val="nil" w:color="FF000000" w:sz="0" w:space="0"/>
+                <w:right w:val="nil" w:color="FF000000" w:sz="0" w:space="0"/>
+                <w:between w:val="nil" w:color="FF000000" w:sz="0" w:space="0"/>
               </w:pBdr>
-              <w:shd w:fill="auto" w:val="clear"/>
-              <w:spacing w:after="0" w:before="0" w:line="240" w:lineRule="auto"/>
+              <w:shd w:val="clear" w:color="auto" w:fill="auto"/>
+              <w:spacing w:before="0" w:after="0" w:line="240" w:lineRule="auto"/>
               <w:ind w:left="0" w:right="0" w:firstLine="0"/>
               <w:jc w:val="left"/>
-              <w:rPr/>
             </w:pPr>
             <w:r>
               <w:rPr>
-                <w:rtl w:val="0"/>
+                <w:lang w:val="es-ES"/>
               </w:rPr>
-              <w:t xml:space="preserve">backend-api</w:t>
+              <w:t>backend-api</w:t>
             </w:r>
           </w:p>
         </w:tc>
       </w:tr>
-      <w:tr>
+      <w:tr xmlns:wp14="http://schemas.microsoft.com/office/word/2010/wordml" wp14:textId="77777777">
         <w:trPr>
           <w:cantSplit w:val="0"/>
           <w:tblHeader w:val="0"/>
         </w:trPr>
         <w:tc>
           <w:tcPr>
-            <w:shd w:fill="auto" w:val="clear"/>
+            <w:shd w:val="clear" w:color="auto" w:fill="auto"/>
             <w:tcMar>
               <w:top w:w="100.0" w:type="dxa"/>
               <w:left w:w="100.0" w:type="dxa"/>
@@ -355,21 +307,21 @@
             </w:tcMar>
             <w:vAlign w:val="top"/>
           </w:tcPr>
-          <w:p>
+          <w:p wp14:textId="77777777">
             <w:pPr>
               <w:keepNext w:val="0"/>
               <w:keepLines w:val="0"/>
               <w:pageBreakBefore w:val="0"/>
               <w:widowControl w:val="0"/>
               <w:pBdr>
-                <w:top w:space="0" w:sz="0" w:val="nil"/>
-                <w:left w:space="0" w:sz="0" w:val="nil"/>
-                <w:bottom w:space="0" w:sz="0" w:val="nil"/>
-                <w:right w:space="0" w:sz="0" w:val="nil"/>
-                <w:between w:space="0" w:sz="0" w:val="nil"/>
+                <w:top w:val="nil" w:sz="0" w:space="0"/>
+                <w:left w:val="nil" w:sz="0" w:space="0"/>
+                <w:bottom w:val="nil" w:sz="0" w:space="0"/>
+                <w:right w:val="nil" w:sz="0" w:space="0"/>
+                <w:between w:val="nil" w:sz="0" w:space="0"/>
               </w:pBdr>
-              <w:shd w:fill="auto" w:val="clear"/>
-              <w:spacing w:after="0" w:before="0" w:line="240" w:lineRule="auto"/>
+              <w:shd w:val="clear" w:fill="auto"/>
+              <w:spacing w:before="0" w:after="0" w:line="240" w:lineRule="auto"/>
               <w:ind w:left="0" w:right="0" w:firstLine="0"/>
               <w:jc w:val="left"/>
               <w:rPr/>
@@ -384,7 +336,7 @@
         </w:tc>
         <w:tc>
           <w:tcPr>
-            <w:shd w:fill="auto" w:val="clear"/>
+            <w:shd w:val="clear" w:color="auto" w:fill="auto"/>
             <w:tcMar>
               <w:top w:w="100.0" w:type="dxa"/>
               <w:left w:w="100.0" w:type="dxa"/>
@@ -393,42 +345,41 @@
             </w:tcMar>
             <w:vAlign w:val="top"/>
           </w:tcPr>
-          <w:p>
+          <w:p wp14:textId="77777777">
             <w:pPr>
               <w:keepNext w:val="0"/>
               <w:keepLines w:val="0"/>
               <w:pageBreakBefore w:val="0"/>
               <w:widowControl w:val="0"/>
               <w:pBdr>
-                <w:top w:space="0" w:sz="0" w:val="nil"/>
-                <w:left w:space="0" w:sz="0" w:val="nil"/>
-                <w:bottom w:space="0" w:sz="0" w:val="nil"/>
-                <w:right w:space="0" w:sz="0" w:val="nil"/>
-                <w:between w:space="0" w:sz="0" w:val="nil"/>
+                <w:top w:val="nil" w:color="FF000000" w:sz="0" w:space="0"/>
+                <w:left w:val="nil" w:color="FF000000" w:sz="0" w:space="0"/>
+                <w:bottom w:val="nil" w:color="FF000000" w:sz="0" w:space="0"/>
+                <w:right w:val="nil" w:color="FF000000" w:sz="0" w:space="0"/>
+                <w:between w:val="nil" w:color="FF000000" w:sz="0" w:space="0"/>
               </w:pBdr>
-              <w:shd w:fill="auto" w:val="clear"/>
-              <w:spacing w:after="0" w:before="0" w:line="240" w:lineRule="auto"/>
+              <w:shd w:val="clear" w:color="auto" w:fill="auto"/>
+              <w:spacing w:before="0" w:after="0" w:line="240" w:lineRule="auto"/>
               <w:ind w:left="0" w:right="0" w:firstLine="0"/>
               <w:jc w:val="left"/>
-              <w:rPr/>
             </w:pPr>
             <w:r>
               <w:rPr>
-                <w:rtl w:val="0"/>
+                <w:lang w:val="es-ES"/>
               </w:rPr>
-              <w:t xml:space="preserve">{"3000/tcp":[{"HostIp":"0.0.0.0","HostPort":"3000"},{"HostIp":"::","HostPort":"3000"}]}</w:t>
+              <w:t>{"3000/tcp":[{"HostIp":"0.0.0.0","HostPort":"3000"},{"HostIp":"::","HostPort":"3000"}]}</w:t>
             </w:r>
           </w:p>
         </w:tc>
       </w:tr>
-      <w:tr>
+      <w:tr xmlns:wp14="http://schemas.microsoft.com/office/word/2010/wordml" wp14:textId="77777777">
         <w:trPr>
           <w:cantSplit w:val="0"/>
           <w:tblHeader w:val="0"/>
         </w:trPr>
         <w:tc>
           <w:tcPr>
-            <w:shd w:fill="auto" w:val="clear"/>
+            <w:shd w:val="clear" w:color="auto" w:fill="auto"/>
             <w:tcMar>
               <w:top w:w="100.0" w:type="dxa"/>
               <w:left w:w="100.0" w:type="dxa"/>
@@ -437,21 +388,21 @@
             </w:tcMar>
             <w:vAlign w:val="top"/>
           </w:tcPr>
-          <w:p>
+          <w:p wp14:textId="77777777">
             <w:pPr>
               <w:keepNext w:val="0"/>
               <w:keepLines w:val="0"/>
               <w:pageBreakBefore w:val="0"/>
               <w:widowControl w:val="0"/>
               <w:pBdr>
-                <w:top w:space="0" w:sz="0" w:val="nil"/>
-                <w:left w:space="0" w:sz="0" w:val="nil"/>
-                <w:bottom w:space="0" w:sz="0" w:val="nil"/>
-                <w:right w:space="0" w:sz="0" w:val="nil"/>
-                <w:between w:space="0" w:sz="0" w:val="nil"/>
+                <w:top w:val="nil" w:sz="0" w:space="0"/>
+                <w:left w:val="nil" w:sz="0" w:space="0"/>
+                <w:bottom w:val="nil" w:sz="0" w:space="0"/>
+                <w:right w:val="nil" w:sz="0" w:space="0"/>
+                <w:between w:val="nil" w:sz="0" w:space="0"/>
               </w:pBdr>
-              <w:shd w:fill="auto" w:val="clear"/>
-              <w:spacing w:after="0" w:before="0" w:line="240" w:lineRule="auto"/>
+              <w:shd w:val="clear" w:fill="auto"/>
+              <w:spacing w:before="0" w:after="0" w:line="240" w:lineRule="auto"/>
               <w:ind w:left="0" w:right="0" w:firstLine="0"/>
               <w:jc w:val="left"/>
               <w:rPr/>
@@ -466,7 +417,7 @@
         </w:tc>
         <w:tc>
           <w:tcPr>
-            <w:shd w:fill="auto" w:val="clear"/>
+            <w:shd w:val="clear" w:color="auto" w:fill="auto"/>
             <w:tcMar>
               <w:top w:w="100.0" w:type="dxa"/>
               <w:left w:w="100.0" w:type="dxa"/>
@@ -475,42 +426,41 @@
             </w:tcMar>
             <w:vAlign w:val="top"/>
           </w:tcPr>
-          <w:p>
+          <w:p wp14:textId="77777777">
             <w:pPr>
               <w:keepNext w:val="0"/>
               <w:keepLines w:val="0"/>
               <w:pageBreakBefore w:val="0"/>
               <w:widowControl w:val="0"/>
               <w:pBdr>
-                <w:top w:space="0" w:sz="0" w:val="nil"/>
-                <w:left w:space="0" w:sz="0" w:val="nil"/>
-                <w:bottom w:space="0" w:sz="0" w:val="nil"/>
-                <w:right w:space="0" w:sz="0" w:val="nil"/>
-                <w:between w:space="0" w:sz="0" w:val="nil"/>
+                <w:top w:val="nil" w:color="FF000000" w:sz="0" w:space="0"/>
+                <w:left w:val="nil" w:color="FF000000" w:sz="0" w:space="0"/>
+                <w:bottom w:val="nil" w:color="FF000000" w:sz="0" w:space="0"/>
+                <w:right w:val="nil" w:color="FF000000" w:sz="0" w:space="0"/>
+                <w:between w:val="nil" w:color="FF000000" w:sz="0" w:space="0"/>
               </w:pBdr>
-              <w:shd w:fill="auto" w:val="clear"/>
-              <w:spacing w:after="0" w:before="0" w:line="240" w:lineRule="auto"/>
+              <w:shd w:val="clear" w:color="auto" w:fill="auto"/>
+              <w:spacing w:before="0" w:after="0" w:line="240" w:lineRule="auto"/>
               <w:ind w:left="0" w:right="0" w:firstLine="0"/>
               <w:jc w:val="left"/>
-              <w:rPr/>
             </w:pPr>
             <w:r>
               <w:rPr>
-                <w:rtl w:val="0"/>
+                <w:lang w:val="es-ES"/>
               </w:rPr>
-              <w:t xml:space="preserve">["PORT=3000","PATH=/usr/local/sbin:/usr/local/bin:/usr/sbin:/usr/bin:/sbin:/bin","NODE_VERSION=24.21.0","YARN_VERSION=1.22.22"]</w:t>
+              <w:t>["PORT=3000","PATH=/usr/local/sbin:/usr/local/bin:/usr/sbin:/usr/bin:/sbin:/bin","NODE_VERSION=24.21.0","YARN_VERSION=1.22.22"]</w:t>
             </w:r>
           </w:p>
         </w:tc>
       </w:tr>
-      <w:tr>
+      <w:tr xmlns:wp14="http://schemas.microsoft.com/office/word/2010/wordml" wp14:textId="77777777">
         <w:trPr>
           <w:cantSplit w:val="0"/>
           <w:tblHeader w:val="0"/>
         </w:trPr>
         <w:tc>
           <w:tcPr>
-            <w:shd w:fill="auto" w:val="clear"/>
+            <w:shd w:val="clear" w:color="auto" w:fill="auto"/>
             <w:tcMar>
               <w:top w:w="100.0" w:type="dxa"/>
               <w:left w:w="100.0" w:type="dxa"/>
@@ -519,21 +469,21 @@
             </w:tcMar>
             <w:vAlign w:val="top"/>
           </w:tcPr>
-          <w:p>
+          <w:p wp14:textId="77777777">
             <w:pPr>
               <w:keepNext w:val="0"/>
               <w:keepLines w:val="0"/>
               <w:pageBreakBefore w:val="0"/>
               <w:widowControl w:val="0"/>
               <w:pBdr>
-                <w:top w:space="0" w:sz="0" w:val="nil"/>
-                <w:left w:space="0" w:sz="0" w:val="nil"/>
-                <w:bottom w:space="0" w:sz="0" w:val="nil"/>
-                <w:right w:space="0" w:sz="0" w:val="nil"/>
-                <w:between w:space="0" w:sz="0" w:val="nil"/>
+                <w:top w:val="nil" w:sz="0" w:space="0"/>
+                <w:left w:val="nil" w:sz="0" w:space="0"/>
+                <w:bottom w:val="nil" w:sz="0" w:space="0"/>
+                <w:right w:val="nil" w:sz="0" w:space="0"/>
+                <w:between w:val="nil" w:sz="0" w:space="0"/>
               </w:pBdr>
-              <w:shd w:fill="auto" w:val="clear"/>
-              <w:spacing w:after="0" w:before="0" w:line="240" w:lineRule="auto"/>
+              <w:shd w:val="clear" w:fill="auto"/>
+              <w:spacing w:before="0" w:after="0" w:line="240" w:lineRule="auto"/>
               <w:ind w:left="0" w:right="0" w:firstLine="0"/>
               <w:jc w:val="left"/>
               <w:rPr/>
@@ -548,7 +498,7 @@
         </w:tc>
         <w:tc>
           <w:tcPr>
-            <w:shd w:fill="auto" w:val="clear"/>
+            <w:shd w:val="clear" w:color="auto" w:fill="auto"/>
             <w:tcMar>
               <w:top w:w="100.0" w:type="dxa"/>
               <w:left w:w="100.0" w:type="dxa"/>
@@ -557,21 +507,21 @@
             </w:tcMar>
             <w:vAlign w:val="top"/>
           </w:tcPr>
-          <w:p>
+          <w:p wp14:textId="77777777">
             <w:pPr>
               <w:keepNext w:val="0"/>
               <w:keepLines w:val="0"/>
               <w:pageBreakBefore w:val="0"/>
               <w:widowControl w:val="0"/>
               <w:pBdr>
-                <w:top w:space="0" w:sz="0" w:val="nil"/>
-                <w:left w:space="0" w:sz="0" w:val="nil"/>
-                <w:bottom w:space="0" w:sz="0" w:val="nil"/>
-                <w:right w:space="0" w:sz="0" w:val="nil"/>
-                <w:between w:space="0" w:sz="0" w:val="nil"/>
+                <w:top w:val="nil" w:sz="0" w:space="0"/>
+                <w:left w:val="nil" w:sz="0" w:space="0"/>
+                <w:bottom w:val="nil" w:sz="0" w:space="0"/>
+                <w:right w:val="nil" w:sz="0" w:space="0"/>
+                <w:between w:val="nil" w:sz="0" w:space="0"/>
               </w:pBdr>
-              <w:shd w:fill="auto" w:val="clear"/>
-              <w:spacing w:after="0" w:before="0" w:line="240" w:lineRule="auto"/>
+              <w:shd w:val="clear" w:fill="auto"/>
+              <w:spacing w:before="0" w:after="0" w:line="240" w:lineRule="auto"/>
               <w:ind w:left="0" w:right="0" w:firstLine="0"/>
               <w:jc w:val="left"/>
               <w:rPr/>
@@ -585,14 +535,14 @@
           </w:p>
         </w:tc>
       </w:tr>
-      <w:tr>
+      <w:tr xmlns:wp14="http://schemas.microsoft.com/office/word/2010/wordml" wp14:textId="77777777">
         <w:trPr>
           <w:cantSplit w:val="0"/>
           <w:tblHeader w:val="0"/>
         </w:trPr>
         <w:tc>
           <w:tcPr>
-            <w:shd w:fill="auto" w:val="clear"/>
+            <w:shd w:val="clear" w:color="auto" w:fill="auto"/>
             <w:tcMar>
               <w:top w:w="100.0" w:type="dxa"/>
               <w:left w:w="100.0" w:type="dxa"/>
@@ -601,21 +551,21 @@
             </w:tcMar>
             <w:vAlign w:val="top"/>
           </w:tcPr>
-          <w:p>
+          <w:p wp14:textId="77777777">
             <w:pPr>
               <w:keepNext w:val="0"/>
               <w:keepLines w:val="0"/>
               <w:pageBreakBefore w:val="0"/>
               <w:widowControl w:val="0"/>
               <w:pBdr>
-                <w:top w:space="0" w:sz="0" w:val="nil"/>
-                <w:left w:space="0" w:sz="0" w:val="nil"/>
-                <w:bottom w:space="0" w:sz="0" w:val="nil"/>
-                <w:right w:space="0" w:sz="0" w:val="nil"/>
-                <w:between w:space="0" w:sz="0" w:val="nil"/>
+                <w:top w:val="nil" w:sz="0" w:space="0"/>
+                <w:left w:val="nil" w:sz="0" w:space="0"/>
+                <w:bottom w:val="nil" w:sz="0" w:space="0"/>
+                <w:right w:val="nil" w:sz="0" w:space="0"/>
+                <w:between w:val="nil" w:sz="0" w:space="0"/>
               </w:pBdr>
-              <w:shd w:fill="auto" w:val="clear"/>
-              <w:spacing w:after="0" w:before="0" w:line="240" w:lineRule="auto"/>
+              <w:shd w:val="clear" w:fill="auto"/>
+              <w:spacing w:before="0" w:after="0" w:line="240" w:lineRule="auto"/>
               <w:ind w:left="0" w:right="0" w:firstLine="0"/>
               <w:jc w:val="left"/>
               <w:rPr/>
@@ -630,7 +580,7 @@
         </w:tc>
         <w:tc>
           <w:tcPr>
-            <w:shd w:fill="auto" w:val="clear"/>
+            <w:shd w:val="clear" w:color="auto" w:fill="auto"/>
             <w:tcMar>
               <w:top w:w="100.0" w:type="dxa"/>
               <w:left w:w="100.0" w:type="dxa"/>
@@ -639,21 +589,21 @@
             </w:tcMar>
             <w:vAlign w:val="top"/>
           </w:tcPr>
-          <w:p>
+          <w:p wp14:textId="77777777">
             <w:pPr>
               <w:keepNext w:val="0"/>
               <w:keepLines w:val="0"/>
               <w:pageBreakBefore w:val="0"/>
               <w:widowControl w:val="0"/>
               <w:pBdr>
-                <w:top w:space="0" w:sz="0" w:val="nil"/>
-                <w:left w:space="0" w:sz="0" w:val="nil"/>
-                <w:bottom w:space="0" w:sz="0" w:val="nil"/>
-                <w:right w:space="0" w:sz="0" w:val="nil"/>
-                <w:between w:space="0" w:sz="0" w:val="nil"/>
+                <w:top w:val="nil" w:sz="0" w:space="0"/>
+                <w:left w:val="nil" w:sz="0" w:space="0"/>
+                <w:bottom w:val="nil" w:sz="0" w:space="0"/>
+                <w:right w:val="nil" w:sz="0" w:space="0"/>
+                <w:between w:val="nil" w:sz="0" w:space="0"/>
               </w:pBdr>
-              <w:shd w:fill="auto" w:val="clear"/>
-              <w:spacing w:after="0" w:before="0" w:line="240" w:lineRule="auto"/>
+              <w:shd w:val="clear" w:fill="auto"/>
+              <w:spacing w:before="0" w:after="0" w:line="240" w:lineRule="auto"/>
               <w:ind w:left="0" w:right="0" w:firstLine="0"/>
               <w:jc w:val="left"/>
               <w:rPr/>
@@ -668,7 +618,7 @@
         </w:tc>
       </w:tr>
     </w:tbl>
-    <w:p>
+    <w:p xmlns:wp14="http://schemas.microsoft.com/office/word/2010/wordml" wp14:textId="77777777">
       <w:pPr>
         <w:widowControl w:val="0"/>
         <w:spacing w:line="240" w:lineRule="auto"/>
@@ -677,9 +627,9 @@
       <w:r>
         <w:rPr/>
         <w:drawing>
-          <wp:inline distB="114300" distT="114300" distL="114300" distR="114300">
+          <wp:inline xmlns:wp14="http://schemas.microsoft.com/office/word/2010/wordprocessingDrawing" distT="114300" distB="114300" distL="114300" distR="114300" wp14:anchorId="6D1B8D63" wp14:editId="7777777">
             <wp:extent cx="6155401" cy="1812472"/>
-            <wp:effectExtent b="0" l="0" r="0" t="0"/>
+            <wp:effectExtent l="0" t="0" r="0" b="0"/>
             <wp:docPr id="2" name="image2.png"/>
             <a:graphic>
               <a:graphicData uri="http://schemas.openxmlformats.org/drawingml/2006/picture">
@@ -690,7 +640,7 @@
                   </pic:nvPicPr>
                   <pic:blipFill>
                     <a:blip r:embed="rId7"/>
-                    <a:srcRect b="0" l="0" r="0" t="0"/>
+                    <a:srcRect l="0" t="0" r="0" b="0"/>
                     <a:stretch>
                       <a:fillRect/>
                     </a:stretch>
@@ -715,42 +665,1794 @@
         </w:rPr>
       </w:r>
     </w:p>
-    <w:p>
+    <w:p xmlns:wp14="http://schemas.microsoft.com/office/word/2010/wordml" wp14:textId="4A37D2A5">
       <w:pPr>
         <w:widowControl w:val="0"/>
         <w:spacing w:line="240" w:lineRule="auto"/>
+      </w:pPr>
+      <w:r>
         <w:rPr/>
-      </w:pPr>
-      <w:r>
+        <w:t>Parte 3.</w:t>
+      </w:r>
+    </w:p>
+    <w:p>
+      <w:pPr>
+        <w:widowControl w:val="0"/>
+        <w:spacing w:line="240" w:lineRule="auto"/>
+        <w:ind w:left="720" w:hanging="0"/>
         <w:rPr>
           <w:rtl w:val="0"/>
-        </w:rPr>
-      </w:r>
-    </w:p>
-    <w:p>
-      <w:pPr>
-        <w:widowControl w:val="0"/>
-        <w:numPr>
-          <w:ilvl w:val="0"/>
-          <w:numId w:val="1"/>
-        </w:numPr>
+          <w:lang w:val="es-ES"/>
+        </w:rPr>
+      </w:pPr>
+    </w:p>
+    <w:p xmlns:wp14="http://schemas.microsoft.com/office/word/2010/wordml" wp14:textId="4BE4A66D">
+      <w:pPr>
+        <w:widowControl w:val="0"/>
         <w:spacing w:line="240" w:lineRule="auto"/>
-        <w:ind w:left="720" w:hanging="360"/>
+        <w:ind w:left="0" w:hanging="0"/>
         <w:rPr>
           <w:u w:val="none"/>
-        </w:rPr>
-      </w:pPr>
-      <w:r>
-        <w:rPr>
+          <w:lang w:val="es-ES"/>
+        </w:rPr>
+      </w:pPr>
+      <w:r>
+        <w:rPr>
+          <w:lang w:val="es-ES"/>
+        </w:rPr>
+        <w:t xml:space="preserve">R/ </w:t>
+      </w:r>
+      <w:r>
+        <w:rPr>
+          <w:lang w:val="es-ES"/>
+        </w:rPr>
+        <w:t xml:space="preserve">El puerto del contenedor es el puerto donde la aplicación escucha dentro del contenedor, en este caso el 3000. El puerto publicado es el puerto de nuestra máquina que Docker conecta con el del contenedor, y es por el que entramos desde afuera. Con -p 3000:3000 los dos son el 3000. Si usáramos -p 8081:3000, la </w:t>
+      </w:r>
+      <w:r>
+        <w:rPr>
+          <w:lang w:val="es-ES"/>
+        </w:rPr>
+        <w:t>app</w:t>
+      </w:r>
+      <w:r>
+        <w:rPr>
+          <w:lang w:val="es-ES"/>
+        </w:rPr>
+        <w:t xml:space="preserve"> seguiría escuchando en el 3000 dentro del contenedor, pero desde nuestra máquina entraríamos por localhost:8081.</w:t>
+      </w:r>
+    </w:p>
+    <w:p>
+      <w:pPr>
+        <w:widowControl w:val="0"/>
+        <w:spacing w:line="240" w:lineRule="auto"/>
+        <w:rPr>
+          <w:u w:val="none"/>
+          <w:lang w:val="es-ES"/>
+        </w:rPr>
+      </w:pPr>
+    </w:p>
+    <w:p>
+      <w:pPr>
+        <w:widowControl w:val="0"/>
+        <w:spacing w:line="240" w:lineRule="auto"/>
+        <w:rPr>
+          <w:u w:val="none"/>
           <w:rtl w:val="0"/>
-        </w:rPr>
-        <w:t xml:space="preserve">El puerto del contenedor es el puerto donde la aplicación escucha dentro del contenedor, en este caso el 3000. El puerto publicado es el puerto de nuestra máquina que Docker conecta con el del contenedor, y es por el que entramos desde afuera. Con -p 3000:3000 los dos son el 3000. Si usáramos -p 8081:3000, la app seguiría escuchando en el 3000 dentro del contenedor, pero desde nuestra máquina entraríamos por localhost:8081.</w:t>
-      </w:r>
+          <w:lang w:val="es-ES"/>
+        </w:rPr>
+      </w:pPr>
+    </w:p>
+    <w:p>
+      <w:pPr>
+        <w:widowControl w:val="0"/>
+        <w:spacing w:line="240" w:lineRule="auto"/>
+        <w:rPr>
+          <w:u w:val="none"/>
+          <w:rtl w:val="0"/>
+          <w:lang w:val="es-ES"/>
+        </w:rPr>
+      </w:pPr>
+    </w:p>
+    <w:p>
+      <w:pPr>
+        <w:widowControl w:val="0"/>
+        <w:spacing w:line="240" w:lineRule="auto"/>
+        <w:rPr>
+          <w:u w:val="none"/>
+          <w:rtl w:val="0"/>
+          <w:lang w:val="es-ES"/>
+        </w:rPr>
+      </w:pPr>
+    </w:p>
+    <w:p>
+      <w:pPr>
+        <w:widowControl w:val="0"/>
+        <w:spacing w:line="240" w:lineRule="auto"/>
+        <w:rPr>
+          <w:u w:val="none"/>
+          <w:rtl w:val="0"/>
+          <w:lang w:val="es-ES"/>
+        </w:rPr>
+      </w:pPr>
+    </w:p>
+    <w:p>
+      <w:pPr>
+        <w:widowControl w:val="0"/>
+        <w:spacing w:line="240" w:lineRule="auto"/>
+        <w:rPr>
+          <w:u w:val="none"/>
+          <w:rtl w:val="0"/>
+          <w:lang w:val="es-ES"/>
+        </w:rPr>
+      </w:pPr>
+    </w:p>
+    <w:p>
+      <w:pPr>
+        <w:widowControl w:val="0"/>
+        <w:spacing w:line="240" w:lineRule="auto"/>
+        <w:rPr>
+          <w:u w:val="none"/>
+          <w:rtl w:val="0"/>
+          <w:lang w:val="es-ES"/>
+        </w:rPr>
+      </w:pPr>
+    </w:p>
+    <w:p>
+      <w:pPr>
+        <w:widowControl w:val="0"/>
+        <w:spacing w:line="240" w:lineRule="auto"/>
+      </w:pPr>
+      <w:r>
+        <w:rPr>
+          <w:u w:val="none"/>
+          <w:lang w:val="es-ES"/>
+        </w:rPr>
+        <w:t xml:space="preserve">Parte </w:t>
+      </w:r>
+      <w:r>
+        <w:rPr>
+          <w:u w:val="none"/>
+          <w:lang w:val="es-ES"/>
+        </w:rPr>
+        <w:t>7.</w:t>
+      </w:r>
+    </w:p>
+    <w:p>
+      <w:pPr>
+        <w:pStyle w:val="Normal"/>
+        <w:widowControl w:val="0"/>
+        <w:spacing w:line="240" w:lineRule="auto"/>
+      </w:pPr>
+      <w:r>
+        <w:drawing>
+          <wp:inline wp14:editId="42EF0B92" wp14:anchorId="719DB720">
+            <wp:extent cx="5724525" cy="1257300"/>
+            <wp:effectExtent l="0" t="0" r="0" b="0"/>
+            <wp:docPr id="1467097546" name="drawing"/>
+            <wp:cNvGraphicFramePr>
+              <a:graphicFrameLocks noChangeAspect="1"/>
+            </wp:cNvGraphicFramePr>
+            <a:graphic>
+              <a:graphicData xmlns:a="http://schemas.openxmlformats.org/drawingml/2006/main" uri="http://schemas.openxmlformats.org/drawingml/2006/picture">
+                <pic:pic xmlns:pic="http://schemas.openxmlformats.org/drawingml/2006/picture">
+                  <pic:nvPicPr>
+                    <pic:cNvPr id="1467097546" name="Picture 1467097546"/>
+                    <pic:cNvPicPr/>
+                  </pic:nvPicPr>
+                  <pic:blipFill>
+                    <a:blip xmlns:r="http://schemas.openxmlformats.org/officeDocument/2006/relationships" r:embed="rId630103143">
+                      <a:extLst>
+                        <a:ext uri="{28A0092B-C50C-407E-A947-70E740481C1C}">
+                          <a14:useLocalDpi xmlns:a14="http://schemas.microsoft.com/office/drawing/2010/main"/>
+                        </a:ext>
+                      </a:extLst>
+                    </a:blip>
+                    <a:stretch>
+                      <a:fillRect/>
+                    </a:stretch>
+                  </pic:blipFill>
+                  <pic:spPr>
+                    <a:xfrm>
+                      <a:off x="0" y="0"/>
+                      <a:ext cx="5724525" cy="1257300"/>
+                    </a:xfrm>
+                    <a:prstGeom prst="rect">
+                      <a:avLst/>
+                    </a:prstGeom>
+                  </pic:spPr>
+                </pic:pic>
+              </a:graphicData>
+            </a:graphic>
+          </wp:inline>
+        </w:drawing>
+      </w:r>
+    </w:p>
+    <w:p>
+      <w:pPr>
+        <w:pStyle w:val="Normal"/>
+        <w:widowControl w:val="0"/>
+        <w:suppressLineNumbers w:val="0"/>
+        <w:bidi w:val="0"/>
+        <w:spacing w:before="0" w:beforeAutospacing="off" w:after="0" w:afterAutospacing="off" w:line="240" w:lineRule="auto"/>
+        <w:ind w:left="0" w:right="0"/>
+        <w:jc w:val="left"/>
+      </w:pPr>
+      <w:r>
+        <w:rPr>
+          <w:lang w:val="es-ES"/>
+        </w:rPr>
+        <w:t xml:space="preserve">R/ </w:t>
+      </w:r>
+      <w:r>
+        <w:rPr>
+          <w:lang w:val="es-ES"/>
+        </w:rPr>
+        <w:t>ports</w:t>
+      </w:r>
+      <w:r>
+        <w:rPr>
+          <w:lang w:val="es-ES"/>
+        </w:rPr>
+        <w:t xml:space="preserve"> publica un puerto del contenedor en la máquina host con el formato </w:t>
+      </w:r>
+      <w:r>
+        <w:rPr>
+          <w:lang w:val="es-ES"/>
+        </w:rPr>
+        <w:t>host:contenedor</w:t>
+      </w:r>
+      <w:r>
+        <w:rPr>
+          <w:lang w:val="es-ES"/>
+        </w:rPr>
+        <w:t xml:space="preserve">. Es como abrir una puerta hacia el exterior, cualquiera que acceda a la máquina puede entrar por ese puerto. </w:t>
+      </w:r>
+    </w:p>
+    <w:p>
+      <w:pPr>
+        <w:pStyle w:val="Normal"/>
+        <w:widowControl w:val="0"/>
+        <w:suppressLineNumbers w:val="0"/>
+        <w:bidi w:val="0"/>
+        <w:spacing w:before="0" w:beforeAutospacing="off" w:after="0" w:afterAutospacing="off" w:line="240" w:lineRule="auto"/>
+        <w:ind w:left="0" w:right="0"/>
+        <w:jc w:val="left"/>
+      </w:pPr>
+      <w:r>
+        <w:br/>
+      </w:r>
+      <w:r>
+        <w:rPr>
+          <w:lang w:val="es-ES"/>
+        </w:rPr>
+        <w:t>expose</w:t>
+      </w:r>
+      <w:r>
+        <w:rPr>
+          <w:lang w:val="es-ES"/>
+        </w:rPr>
+        <w:t xml:space="preserve"> solo declara que el contenedor escucha en un puerto para uso interno. No lo publica en el host, así que desde afuera no es accesible, pero los demás contenedores de la misma red Docker sí pueden usarlo. En la práctica funciona como documentación, porque la</w:t>
+      </w:r>
+      <w:r>
+        <w:rPr>
+          <w:lang w:val="es-ES"/>
+        </w:rPr>
+        <w:t xml:space="preserve"> </w:t>
+      </w:r>
+      <w:r>
+        <w:rPr>
+          <w:lang w:val="es-ES"/>
+        </w:rPr>
+        <w:t>comunicación interna la permite la red compartida.</w:t>
+      </w:r>
+      <w:r>
+        <w:rPr>
+          <w:lang w:val="es-ES"/>
+        </w:rPr>
+        <w:t xml:space="preserve">En nuestro caso, al quitar </w:t>
+      </w:r>
+      <w:r>
+        <w:rPr>
+          <w:lang w:val="es-ES"/>
+        </w:rPr>
+        <w:t>ports</w:t>
+      </w:r>
+      <w:r>
+        <w:rPr>
+          <w:lang w:val="es-ES"/>
+        </w:rPr>
+        <w:t xml:space="preserve">: "3000:3000" y dejar </w:t>
+      </w:r>
+      <w:r>
+        <w:rPr>
+          <w:lang w:val="es-ES"/>
+        </w:rPr>
+        <w:t>expose</w:t>
+      </w:r>
+      <w:r>
+        <w:rPr>
+          <w:lang w:val="es-ES"/>
+        </w:rPr>
+        <w:t xml:space="preserve">: "3000" en api, localhost:3000 dejó de responder, mientras que </w:t>
+      </w:r>
+      <w:r>
+        <w:rPr>
+          <w:lang w:val="es-ES"/>
+        </w:rPr>
+        <w:t>Nginx</w:t>
+      </w:r>
+      <w:r>
+        <w:rPr>
+          <w:lang w:val="es-ES"/>
+        </w:rPr>
+        <w:t xml:space="preserve"> siguió llegando a api:3000. Así, la única entrada pública quedó en localhost:8080.</w:t>
+      </w:r>
+    </w:p>
+    <w:p>
+      <w:pPr>
+        <w:pStyle w:val="Normal"/>
+        <w:widowControl w:val="0"/>
+        <w:suppressLineNumbers w:val="0"/>
+        <w:bidi w:val="0"/>
+        <w:spacing w:before="0" w:beforeAutospacing="off" w:after="0" w:afterAutospacing="off" w:line="240" w:lineRule="auto"/>
+        <w:ind w:left="0" w:right="0"/>
+        <w:jc w:val="left"/>
+        <w:rPr>
+          <w:lang w:val="es-ES"/>
+        </w:rPr>
+      </w:pPr>
+    </w:p>
+    <w:p>
+      <w:pPr>
+        <w:pStyle w:val="Normal"/>
+        <w:widowControl w:val="0"/>
+        <w:suppressLineNumbers w:val="0"/>
+        <w:bidi w:val="0"/>
+        <w:spacing w:before="0" w:beforeAutospacing="off" w:after="0" w:afterAutospacing="off" w:line="240" w:lineRule="auto"/>
+        <w:ind w:left="0" w:right="0"/>
+        <w:jc w:val="left"/>
+      </w:pPr>
+      <w:r>
+        <w:rPr>
+          <w:lang w:val="es-ES"/>
+        </w:rPr>
+        <w:t xml:space="preserve">Parte 8. </w:t>
+      </w:r>
+    </w:p>
+    <w:p>
+      <w:pPr>
+        <w:pStyle w:val="Normal"/>
+        <w:widowControl w:val="0"/>
+        <w:suppressLineNumbers w:val="0"/>
+        <w:bidi w:val="0"/>
+        <w:spacing w:before="0" w:beforeAutospacing="off" w:after="0" w:afterAutospacing="off" w:line="240" w:lineRule="auto"/>
+        <w:ind w:left="0" w:right="0"/>
+        <w:jc w:val="left"/>
+        <w:rPr>
+          <w:lang w:val="es-ES"/>
+        </w:rPr>
+      </w:pPr>
+    </w:p>
+    <w:p>
+      <w:pPr>
+        <w:pStyle w:val="Normal"/>
+        <w:widowControl w:val="0"/>
+        <w:bidi w:val="0"/>
+        <w:spacing w:before="0" w:beforeAutospacing="off" w:after="0" w:afterAutospacing="off" w:line="240" w:lineRule="auto"/>
+        <w:ind w:left="0" w:right="0"/>
+        <w:jc w:val="left"/>
+      </w:pPr>
+      <w:r>
+        <w:drawing>
+          <wp:inline wp14:editId="6A5D33E8" wp14:anchorId="1965FD6F">
+            <wp:extent cx="5724525" cy="800100"/>
+            <wp:effectExtent l="0" t="0" r="0" b="0"/>
+            <wp:docPr id="566226199" name="drawing"/>
+            <wp:cNvGraphicFramePr>
+              <a:graphicFrameLocks noChangeAspect="1"/>
+            </wp:cNvGraphicFramePr>
+            <a:graphic>
+              <a:graphicData xmlns:a="http://schemas.openxmlformats.org/drawingml/2006/main" uri="http://schemas.openxmlformats.org/drawingml/2006/picture">
+                <pic:pic xmlns:pic="http://schemas.openxmlformats.org/drawingml/2006/picture">
+                  <pic:nvPicPr>
+                    <pic:cNvPr id="566226199" name="Picture 566226199"/>
+                    <pic:cNvPicPr/>
+                  </pic:nvPicPr>
+                  <pic:blipFill>
+                    <a:blip xmlns:r="http://schemas.openxmlformats.org/officeDocument/2006/relationships" r:embed="rId321347575">
+                      <a:extLst>
+                        <a:ext uri="{28A0092B-C50C-407E-A947-70E740481C1C}">
+                          <a14:useLocalDpi xmlns:a14="http://schemas.microsoft.com/office/drawing/2010/main"/>
+                        </a:ext>
+                      </a:extLst>
+                    </a:blip>
+                    <a:stretch>
+                      <a:fillRect/>
+                    </a:stretch>
+                  </pic:blipFill>
+                  <pic:spPr>
+                    <a:xfrm>
+                      <a:off x="0" y="0"/>
+                      <a:ext cx="5724525" cy="800100"/>
+                    </a:xfrm>
+                    <a:prstGeom prst="rect">
+                      <a:avLst/>
+                    </a:prstGeom>
+                  </pic:spPr>
+                </pic:pic>
+              </a:graphicData>
+            </a:graphic>
+          </wp:inline>
+        </w:drawing>
+      </w:r>
+      <w:r>
+        <w:br/>
+      </w:r>
+      <w:r>
+        <w:drawing>
+          <wp:inline wp14:editId="0807B6E3" wp14:anchorId="4E1B9EB6">
+            <wp:extent cx="5724525" cy="981075"/>
+            <wp:effectExtent l="0" t="0" r="0" b="0"/>
+            <wp:docPr id="915434202" name="drawing"/>
+            <wp:cNvGraphicFramePr>
+              <a:graphicFrameLocks noChangeAspect="1"/>
+            </wp:cNvGraphicFramePr>
+            <a:graphic>
+              <a:graphicData xmlns:a="http://schemas.openxmlformats.org/drawingml/2006/main" uri="http://schemas.openxmlformats.org/drawingml/2006/picture">
+                <pic:pic xmlns:pic="http://schemas.openxmlformats.org/drawingml/2006/picture">
+                  <pic:nvPicPr>
+                    <pic:cNvPr id="915434202" name="Picture 915434202"/>
+                    <pic:cNvPicPr/>
+                  </pic:nvPicPr>
+                  <pic:blipFill>
+                    <a:blip xmlns:r="http://schemas.openxmlformats.org/officeDocument/2006/relationships" r:embed="rId1815438987">
+                      <a:extLst>
+                        <a:ext uri="{28A0092B-C50C-407E-A947-70E740481C1C}">
+                          <a14:useLocalDpi xmlns:a14="http://schemas.microsoft.com/office/drawing/2010/main"/>
+                        </a:ext>
+                      </a:extLst>
+                    </a:blip>
+                    <a:stretch>
+                      <a:fillRect/>
+                    </a:stretch>
+                  </pic:blipFill>
+                  <pic:spPr>
+                    <a:xfrm>
+                      <a:off x="0" y="0"/>
+                      <a:ext cx="5724525" cy="981075"/>
+                    </a:xfrm>
+                    <a:prstGeom prst="rect">
+                      <a:avLst/>
+                    </a:prstGeom>
+                  </pic:spPr>
+                </pic:pic>
+              </a:graphicData>
+            </a:graphic>
+          </wp:inline>
+        </w:drawing>
+      </w:r>
+    </w:p>
+    <w:p>
+      <w:pPr>
+        <w:pStyle w:val="Normal"/>
+        <w:widowControl w:val="0"/>
+        <w:bidi w:val="0"/>
+        <w:spacing w:before="0" w:beforeAutospacing="off" w:after="0" w:afterAutospacing="off" w:line="240" w:lineRule="auto"/>
+        <w:ind w:left="0" w:right="0"/>
+        <w:jc w:val="left"/>
+        <w:rPr>
+          <w:lang w:val="es-ES"/>
+        </w:rPr>
+      </w:pPr>
+      <w:r>
+        <w:rPr>
+          <w:lang w:val="es-ES"/>
+        </w:rPr>
+        <w:t xml:space="preserve">Parte 9. </w:t>
+      </w:r>
+      <w:r>
+        <w:br/>
+      </w:r>
+      <w:r>
+        <w:drawing>
+          <wp:inline wp14:editId="7899AE4C" wp14:anchorId="0EAA7E60">
+            <wp:extent cx="3724275" cy="2528293"/>
+            <wp:effectExtent l="0" t="0" r="0" b="0"/>
+            <wp:docPr id="162657609" name="drawing"/>
+            <wp:cNvGraphicFramePr>
+              <a:graphicFrameLocks noChangeAspect="1"/>
+            </wp:cNvGraphicFramePr>
+            <a:graphic>
+              <a:graphicData xmlns:a="http://schemas.openxmlformats.org/drawingml/2006/main" uri="http://schemas.openxmlformats.org/drawingml/2006/picture">
+                <pic:pic xmlns:pic="http://schemas.openxmlformats.org/drawingml/2006/picture">
+                  <pic:nvPicPr>
+                    <pic:cNvPr id="162657609" name="Picture 162657609"/>
+                    <pic:cNvPicPr/>
+                  </pic:nvPicPr>
+                  <pic:blipFill>
+                    <a:blip xmlns:r="http://schemas.openxmlformats.org/officeDocument/2006/relationships" r:embed="rId819288916">
+                      <a:extLst>
+                        <a:ext uri="{28A0092B-C50C-407E-A947-70E740481C1C}">
+                          <a14:useLocalDpi xmlns:a14="http://schemas.microsoft.com/office/drawing/2010/main"/>
+                        </a:ext>
+                      </a:extLst>
+                    </a:blip>
+                    <a:stretch>
+                      <a:fillRect/>
+                    </a:stretch>
+                  </pic:blipFill>
+                  <pic:spPr>
+                    <a:xfrm rot="0">
+                      <a:off x="0" y="0"/>
+                      <a:ext cx="3724275" cy="2528293"/>
+                    </a:xfrm>
+                    <a:prstGeom prst="rect">
+                      <a:avLst/>
+                    </a:prstGeom>
+                  </pic:spPr>
+                </pic:pic>
+              </a:graphicData>
+            </a:graphic>
+          </wp:inline>
+        </w:drawing>
+      </w:r>
+      <w:r>
+        <w:br/>
+      </w:r>
+      <w:r>
+        <w:br/>
+      </w:r>
+      <w:r>
+        <w:br/>
+      </w:r>
+      <w:r>
+        <w:drawing>
+          <wp:inline wp14:editId="75E7C0D8" wp14:anchorId="0385444F">
+            <wp:extent cx="5724525" cy="1266825"/>
+            <wp:effectExtent l="0" t="0" r="0" b="0"/>
+            <wp:docPr id="1380131623" name="drawing"/>
+            <wp:cNvGraphicFramePr>
+              <a:graphicFrameLocks noChangeAspect="1"/>
+            </wp:cNvGraphicFramePr>
+            <a:graphic>
+              <a:graphicData xmlns:a="http://schemas.openxmlformats.org/drawingml/2006/main" uri="http://schemas.openxmlformats.org/drawingml/2006/picture">
+                <pic:pic xmlns:pic="http://schemas.openxmlformats.org/drawingml/2006/picture">
+                  <pic:nvPicPr>
+                    <pic:cNvPr id="1894209388" name="Picture 1894209388"/>
+                    <pic:cNvPicPr/>
+                  </pic:nvPicPr>
+                  <pic:blipFill>
+                    <a:blip xmlns:r="http://schemas.openxmlformats.org/officeDocument/2006/relationships" r:embed="rId952795509">
+                      <a:extLst>
+                        <a:ext uri="{28A0092B-C50C-407E-A947-70E740481C1C}">
+                          <a14:useLocalDpi xmlns:a14="http://schemas.microsoft.com/office/drawing/2010/main"/>
+                        </a:ext>
+                      </a:extLst>
+                    </a:blip>
+                    <a:stretch>
+                      <a:fillRect/>
+                    </a:stretch>
+                  </pic:blipFill>
+                  <pic:spPr>
+                    <a:xfrm>
+                      <a:off x="0" y="0"/>
+                      <a:ext cx="5724525" cy="1266825"/>
+                    </a:xfrm>
+                    <a:prstGeom prst="rect">
+                      <a:avLst/>
+                    </a:prstGeom>
+                  </pic:spPr>
+                </pic:pic>
+              </a:graphicData>
+            </a:graphic>
+          </wp:inline>
+        </w:drawing>
+      </w:r>
+      <w:r>
+        <w:br/>
+      </w:r>
+      <w:r>
+        <w:rPr>
+          <w:lang w:val="es-ES"/>
+        </w:rPr>
+        <w:t>R</w:t>
+      </w:r>
+      <w:r>
+        <w:rPr>
+          <w:lang w:val="es-ES"/>
+        </w:rPr>
+        <w:t xml:space="preserve"> (</w:t>
+      </w:r>
+      <w:r>
+        <w:rPr>
+          <w:lang w:val="es-ES"/>
+        </w:rPr>
+        <w:t>8</w:t>
+      </w:r>
+      <w:r>
+        <w:rPr>
+          <w:lang w:val="es-ES"/>
+        </w:rPr>
+        <w:t>-</w:t>
+      </w:r>
+      <w:r>
+        <w:rPr>
+          <w:lang w:val="es-ES"/>
+        </w:rPr>
+        <w:t>9</w:t>
+      </w:r>
+      <w:r>
+        <w:rPr>
+          <w:lang w:val="es-ES"/>
+        </w:rPr>
+        <w:t xml:space="preserve">) </w:t>
+      </w:r>
+      <w:r>
+        <w:rPr>
+          <w:lang w:val="es-ES"/>
+        </w:rPr>
+        <w:t>/</w:t>
+      </w:r>
+      <w:r>
+        <w:rPr>
+          <w:lang w:val="es-ES"/>
+        </w:rPr>
+        <w:t xml:space="preserve"> </w:t>
+      </w:r>
+      <w:r>
+        <w:br/>
+      </w:r>
+      <w:r>
+        <w:rPr>
+          <w:lang w:val="es-ES"/>
+        </w:rPr>
+        <w:t xml:space="preserve">El error que arroja es </w:t>
+      </w:r>
+      <w:r>
+        <w:rPr>
+          <w:lang w:val="es-ES"/>
+        </w:rPr>
+        <w:t>“</w:t>
+      </w:r>
+      <w:r>
+        <w:rPr>
+          <w:lang w:val="es-ES"/>
+        </w:rPr>
+        <w:t>502</w:t>
+      </w:r>
+      <w:r>
+        <w:rPr>
+          <w:lang w:val="es-ES"/>
+        </w:rPr>
+        <w:t>,</w:t>
+      </w:r>
+      <w:r>
+        <w:rPr>
+          <w:lang w:val="es-ES"/>
+        </w:rPr>
+        <w:t xml:space="preserve"> Bad Gateway”. Esto pasa porque </w:t>
+      </w:r>
+      <w:r>
+        <w:rPr>
+          <w:lang w:val="es-ES"/>
+        </w:rPr>
+        <w:t>Nginx</w:t>
+      </w:r>
+      <w:r>
+        <w:rPr>
+          <w:lang w:val="es-ES"/>
+        </w:rPr>
+        <w:t xml:space="preserve"> recibió la petición, pero no se obtuvo respuesta del servidor al que tiene que redirigirla</w:t>
+      </w:r>
+      <w:r>
+        <w:rPr>
+          <w:lang w:val="es-ES"/>
+        </w:rPr>
+        <w:t xml:space="preserve">, en esto caso intenta redirigirla a localhost, que dentro del contendor </w:t>
+      </w:r>
+      <w:r>
+        <w:rPr>
+          <w:lang w:val="es-ES"/>
+        </w:rPr>
+        <w:t>Nginx</w:t>
+      </w:r>
+      <w:r>
+        <w:rPr>
+          <w:lang w:val="es-ES"/>
+        </w:rPr>
+        <w:t xml:space="preserve">, </w:t>
+      </w:r>
+      <w:r>
+        <w:rPr>
+          <w:lang w:val="es-ES"/>
+        </w:rPr>
+        <w:t xml:space="preserve">es </w:t>
+      </w:r>
+      <w:r>
+        <w:rPr>
+          <w:lang w:val="es-ES"/>
+        </w:rPr>
+        <w:t>é</w:t>
+      </w:r>
+      <w:r>
+        <w:rPr>
+          <w:lang w:val="es-ES"/>
+        </w:rPr>
+        <w:t xml:space="preserve">l mismo y ahí no tenemos ningún proceso escuchando </w:t>
+      </w:r>
+      <w:r>
+        <w:rPr>
+          <w:lang w:val="es-ES"/>
+        </w:rPr>
+        <w:t>en el 3000, solamente escucha en el 8080. La API está en otro contenedor aparte.</w:t>
+      </w:r>
+    </w:p>
+    <w:p>
+      <w:pPr>
+        <w:pStyle w:val="Normal"/>
+        <w:widowControl w:val="0"/>
+        <w:bidi w:val="0"/>
+        <w:spacing w:before="0" w:beforeAutospacing="off" w:after="0" w:afterAutospacing="off" w:line="240" w:lineRule="auto"/>
+        <w:ind w:left="0" w:right="0"/>
+        <w:jc w:val="left"/>
+      </w:pPr>
+      <w:r>
+        <w:br/>
+      </w:r>
+    </w:p>
+    <w:p>
+      <w:pPr>
+        <w:pStyle w:val="Normal"/>
+        <w:widowControl w:val="0"/>
+        <w:bidi w:val="0"/>
+        <w:spacing w:before="0" w:beforeAutospacing="off" w:after="0" w:afterAutospacing="off" w:line="240" w:lineRule="auto"/>
+        <w:ind w:left="0" w:right="0"/>
+        <w:jc w:val="left"/>
+        <w:rPr>
+          <w:lang w:val="es-ES"/>
+        </w:rPr>
+      </w:pPr>
+    </w:p>
+    <w:p>
+      <w:pPr>
+        <w:pStyle w:val="Normal"/>
+        <w:widowControl w:val="0"/>
+        <w:bidi w:val="0"/>
+        <w:spacing w:before="0" w:beforeAutospacing="off" w:after="0" w:afterAutospacing="off" w:line="240" w:lineRule="auto"/>
+        <w:ind w:left="0" w:right="0"/>
+        <w:jc w:val="left"/>
+      </w:pPr>
+      <w:r>
+        <w:rPr>
+          <w:lang w:val="es-ES"/>
+        </w:rPr>
+        <w:t>R (</w:t>
+      </w:r>
+      <w:r>
+        <w:rPr>
+          <w:lang w:val="es-ES"/>
+        </w:rPr>
+        <w:t>10-12</w:t>
+      </w:r>
+      <w:r>
+        <w:rPr>
+          <w:lang w:val="es-ES"/>
+        </w:rPr>
+        <w:t>) /</w:t>
+      </w:r>
+    </w:p>
+    <w:p>
+      <w:pPr>
+        <w:pStyle w:val="Normal"/>
+        <w:widowControl w:val="0"/>
+        <w:suppressLineNumbers w:val="0"/>
+        <w:bidi w:val="0"/>
+        <w:spacing w:before="0" w:beforeAutospacing="off" w:after="0" w:afterAutospacing="off" w:line="240" w:lineRule="auto"/>
+        <w:ind w:left="0" w:right="0"/>
+        <w:jc w:val="left"/>
+        <w:rPr>
+          <w:lang w:val="es-ES"/>
+        </w:rPr>
+      </w:pPr>
+      <w:r>
+        <w:rPr>
+          <w:lang w:val="es-ES"/>
+        </w:rPr>
+        <w:t xml:space="preserve">El localhost no representa al contendor API porque cada contendor tiene su </w:t>
+      </w:r>
+      <w:r>
+        <w:rPr>
+          <w:lang w:val="es-ES"/>
+        </w:rPr>
+        <w:t>propio localhost y su propia IP</w:t>
+      </w:r>
+      <w:r>
+        <w:rPr>
+          <w:lang w:val="es-ES"/>
+        </w:rPr>
+        <w:t>.</w:t>
+      </w:r>
+      <w:r>
+        <w:rPr>
+          <w:lang w:val="es-ES"/>
+        </w:rPr>
+        <w:t xml:space="preserve"> Contestando la pregunta 12 enseguida podemos</w:t>
+      </w:r>
+      <w:r>
+        <w:rPr>
+          <w:lang w:val="es-ES"/>
+        </w:rPr>
+        <w:t xml:space="preserve"> utilizar "</w:t>
+      </w:r>
+      <w:r>
+        <w:rPr>
+          <w:lang w:val="es-ES"/>
+        </w:rPr>
+        <w:t>docker</w:t>
+      </w:r>
+      <w:r>
+        <w:rPr>
+          <w:lang w:val="es-ES"/>
+        </w:rPr>
+        <w:t xml:space="preserve"> </w:t>
+      </w:r>
+      <w:r>
+        <w:rPr>
+          <w:lang w:val="es-ES"/>
+        </w:rPr>
+        <w:t>network</w:t>
+      </w:r>
+      <w:r>
+        <w:rPr>
+          <w:lang w:val="es-ES"/>
+        </w:rPr>
+        <w:t xml:space="preserve"> </w:t>
+      </w:r>
+      <w:r>
+        <w:rPr>
+          <w:lang w:val="es-ES"/>
+        </w:rPr>
+        <w:t>ls</w:t>
+      </w:r>
+      <w:r>
+        <w:rPr>
+          <w:lang w:val="es-ES"/>
+        </w:rPr>
+        <w:t xml:space="preserve">" para ver las redes y </w:t>
+      </w:r>
+      <w:r>
+        <w:rPr>
+          <w:lang w:val="es-ES"/>
+        </w:rPr>
+        <w:t>con el comando "</w:t>
+      </w:r>
+      <w:r>
+        <w:rPr>
+          <w:lang w:val="es-ES"/>
+        </w:rPr>
+        <w:t>docker</w:t>
+      </w:r>
+      <w:r>
+        <w:rPr>
+          <w:lang w:val="es-ES"/>
+        </w:rPr>
+        <w:t xml:space="preserve"> </w:t>
+      </w:r>
+      <w:r>
+        <w:rPr>
+          <w:lang w:val="es-ES"/>
+        </w:rPr>
+        <w:t>network</w:t>
+      </w:r>
+      <w:r>
+        <w:rPr>
+          <w:lang w:val="es-ES"/>
+        </w:rPr>
+        <w:t xml:space="preserve"> </w:t>
+      </w:r>
+      <w:r>
+        <w:rPr>
+          <w:lang w:val="es-ES"/>
+        </w:rPr>
+        <w:t>inspect</w:t>
+      </w:r>
+      <w:r>
+        <w:rPr>
+          <w:lang w:val="es-ES"/>
+        </w:rPr>
+        <w:t xml:space="preserve">" podemos ver que contenedores están conectados y sus </w:t>
+      </w:r>
+      <w:r>
+        <w:rPr>
+          <w:lang w:val="es-ES"/>
+        </w:rPr>
+        <w:t>ips</w:t>
+      </w:r>
+      <w:r>
+        <w:rPr>
+          <w:lang w:val="es-ES"/>
+        </w:rPr>
+        <w:t xml:space="preserve">, este comando lo usamos para reforzar la respuesta 10 ya que podemos ver que </w:t>
+      </w:r>
+      <w:r>
+        <w:rPr>
+          <w:lang w:val="es-ES"/>
+        </w:rPr>
+        <w:t>Nginx</w:t>
+      </w:r>
+      <w:r>
+        <w:rPr>
+          <w:lang w:val="es-ES"/>
+        </w:rPr>
+        <w:t xml:space="preserve"> y API tienen IPS distintas.</w:t>
+      </w:r>
+    </w:p>
+    <w:p>
+      <w:pPr>
+        <w:pStyle w:val="Normal"/>
+        <w:widowControl w:val="0"/>
+        <w:suppressLineNumbers w:val="0"/>
+        <w:bidi w:val="0"/>
+        <w:spacing w:before="0" w:beforeAutospacing="off" w:after="0" w:afterAutospacing="off" w:line="240" w:lineRule="auto"/>
+        <w:ind w:left="0" w:right="0"/>
+        <w:jc w:val="left"/>
+        <w:rPr>
+          <w:lang w:val="es-ES"/>
+        </w:rPr>
+      </w:pPr>
+    </w:p>
+    <w:p>
+      <w:pPr>
+        <w:pStyle w:val="Normal"/>
+        <w:widowControl w:val="0"/>
+        <w:suppressLineNumbers w:val="0"/>
+        <w:bidi w:val="0"/>
+        <w:spacing w:before="0" w:beforeAutospacing="off" w:after="0" w:afterAutospacing="off" w:line="240" w:lineRule="auto"/>
+        <w:ind w:left="0" w:right="0"/>
+        <w:jc w:val="left"/>
+        <w:rPr>
+          <w:lang w:val="es-ES"/>
+        </w:rPr>
+      </w:pPr>
+    </w:p>
+    <w:p>
+      <w:pPr>
+        <w:pStyle w:val="Normal"/>
+        <w:widowControl w:val="0"/>
+        <w:suppressLineNumbers w:val="0"/>
+        <w:bidi w:val="0"/>
+        <w:spacing w:before="0" w:beforeAutospacing="off" w:after="0" w:afterAutospacing="off" w:line="240" w:lineRule="auto"/>
+        <w:ind w:left="0" w:right="0"/>
+        <w:jc w:val="left"/>
+        <w:rPr>
+          <w:lang w:val="es-ES"/>
+        </w:rPr>
+      </w:pPr>
+    </w:p>
+    <w:p>
+      <w:pPr>
+        <w:pStyle w:val="Normal"/>
+        <w:widowControl w:val="0"/>
+        <w:suppressLineNumbers w:val="0"/>
+        <w:bidi w:val="0"/>
+        <w:spacing w:before="0" w:beforeAutospacing="off" w:after="0" w:afterAutospacing="off" w:line="240" w:lineRule="auto"/>
+        <w:ind w:left="0" w:right="0"/>
+        <w:jc w:val="left"/>
+      </w:pPr>
+      <w:r>
+        <w:drawing>
+          <wp:inline wp14:editId="5E3CA9B7" wp14:anchorId="62550B16">
+            <wp:extent cx="5724525" cy="4391025"/>
+            <wp:effectExtent l="0" t="0" r="0" b="0"/>
+            <wp:docPr id="636310424" name="drawing"/>
+            <wp:cNvGraphicFramePr>
+              <a:graphicFrameLocks noChangeAspect="1"/>
+            </wp:cNvGraphicFramePr>
+            <a:graphic>
+              <a:graphicData xmlns:a="http://schemas.openxmlformats.org/drawingml/2006/main" uri="http://schemas.openxmlformats.org/drawingml/2006/picture">
+                <pic:pic xmlns:pic="http://schemas.openxmlformats.org/drawingml/2006/picture">
+                  <pic:nvPicPr>
+                    <pic:cNvPr id="636310424" name="Picture 636310424"/>
+                    <pic:cNvPicPr/>
+                  </pic:nvPicPr>
+                  <pic:blipFill>
+                    <a:blip xmlns:r="http://schemas.openxmlformats.org/officeDocument/2006/relationships" r:embed="rId1658490198">
+                      <a:extLst>
+                        <a:ext uri="{28A0092B-C50C-407E-A947-70E740481C1C}">
+                          <a14:useLocalDpi xmlns:a14="http://schemas.microsoft.com/office/drawing/2010/main"/>
+                        </a:ext>
+                      </a:extLst>
+                    </a:blip>
+                    <a:stretch>
+                      <a:fillRect/>
+                    </a:stretch>
+                  </pic:blipFill>
+                  <pic:spPr>
+                    <a:xfrm>
+                      <a:off x="0" y="0"/>
+                      <a:ext cx="5724525" cy="4391025"/>
+                    </a:xfrm>
+                    <a:prstGeom prst="rect">
+                      <a:avLst/>
+                    </a:prstGeom>
+                  </pic:spPr>
+                </pic:pic>
+              </a:graphicData>
+            </a:graphic>
+          </wp:inline>
+        </w:drawing>
+      </w:r>
+      <w:r>
+        <w:br/>
+      </w:r>
+      <w:r>
+        <w:drawing>
+          <wp:inline wp14:editId="2A73FE93" wp14:anchorId="376122A3">
+            <wp:extent cx="5724525" cy="3200400"/>
+            <wp:effectExtent l="0" t="0" r="0" b="0"/>
+            <wp:docPr id="2088685895" name="drawing"/>
+            <wp:cNvGraphicFramePr>
+              <a:graphicFrameLocks noChangeAspect="1"/>
+            </wp:cNvGraphicFramePr>
+            <a:graphic>
+              <a:graphicData xmlns:a="http://schemas.openxmlformats.org/drawingml/2006/main" uri="http://schemas.openxmlformats.org/drawingml/2006/picture">
+                <pic:pic xmlns:pic="http://schemas.openxmlformats.org/drawingml/2006/picture">
+                  <pic:nvPicPr>
+                    <pic:cNvPr id="2088685895" name="Picture 2088685895"/>
+                    <pic:cNvPicPr/>
+                  </pic:nvPicPr>
+                  <pic:blipFill>
+                    <a:blip xmlns:r="http://schemas.openxmlformats.org/officeDocument/2006/relationships" r:embed="rId1027863424">
+                      <a:extLst>
+                        <a:ext uri="{28A0092B-C50C-407E-A947-70E740481C1C}">
+                          <a14:useLocalDpi xmlns:a14="http://schemas.microsoft.com/office/drawing/2010/main"/>
+                        </a:ext>
+                      </a:extLst>
+                    </a:blip>
+                    <a:stretch>
+                      <a:fillRect/>
+                    </a:stretch>
+                  </pic:blipFill>
+                  <pic:spPr>
+                    <a:xfrm>
+                      <a:off x="0" y="0"/>
+                      <a:ext cx="5724525" cy="3200400"/>
+                    </a:xfrm>
+                    <a:prstGeom prst="rect">
+                      <a:avLst/>
+                    </a:prstGeom>
+                  </pic:spPr>
+                </pic:pic>
+              </a:graphicData>
+            </a:graphic>
+          </wp:inline>
+        </w:drawing>
+      </w:r>
+      <w:r>
+        <w:br/>
+      </w:r>
+      <w:r>
+        <w:rPr/>
+        <w:t>R (11) /</w:t>
+      </w:r>
+    </w:p>
+    <w:p>
+      <w:pPr>
+        <w:pStyle w:val="Normal"/>
+        <w:widowControl w:val="0"/>
+        <w:suppressLineNumbers w:val="0"/>
+        <w:bidi w:val="0"/>
+        <w:spacing w:before="0" w:beforeAutospacing="off" w:after="0" w:afterAutospacing="off" w:line="240" w:lineRule="auto"/>
+        <w:ind w:left="0" w:right="0"/>
+        <w:jc w:val="left"/>
+        <w:rPr>
+          <w:lang w:val="es-ES"/>
+        </w:rPr>
+      </w:pPr>
+      <w:r>
+        <w:rPr>
+          <w:lang w:val="es-ES"/>
+        </w:rPr>
+        <w:t xml:space="preserve">Nosotros solucionaríamos el problema volviendo a api:3000 y funcionaría ya que el Docker </w:t>
+      </w:r>
+      <w:r>
+        <w:rPr>
+          <w:lang w:val="es-ES"/>
+        </w:rPr>
+        <w:t>Compose</w:t>
+      </w:r>
+      <w:r>
+        <w:rPr>
+          <w:lang w:val="es-ES"/>
+        </w:rPr>
+        <w:t xml:space="preserve"> crea una red y un DNS interno que traduce el nombre del servicio a la IP del contendor de la API dentro de esa</w:t>
+      </w:r>
+      <w:r>
+        <w:rPr>
+          <w:lang w:val="es-ES"/>
+        </w:rPr>
+        <w:t xml:space="preserve"> red.</w:t>
+      </w:r>
+      <w:r>
+        <w:br/>
+      </w:r>
+      <w:r>
+        <w:br/>
+      </w:r>
+      <w:r>
+        <w:rPr>
+          <w:lang w:val="es-ES"/>
+        </w:rPr>
+        <w:t xml:space="preserve">Revertimos el cambio: </w:t>
+      </w:r>
+      <w:r>
+        <w:br/>
+      </w:r>
+      <w:r>
+        <w:drawing>
+          <wp:inline wp14:editId="7170E0A2" wp14:anchorId="753A8D3B">
+            <wp:extent cx="5724525" cy="3333750"/>
+            <wp:effectExtent l="0" t="0" r="0" b="0"/>
+            <wp:docPr id="398612937" name="drawing"/>
+            <wp:cNvGraphicFramePr>
+              <a:graphicFrameLocks noChangeAspect="1"/>
+            </wp:cNvGraphicFramePr>
+            <a:graphic>
+              <a:graphicData xmlns:a="http://schemas.openxmlformats.org/drawingml/2006/main" uri="http://schemas.openxmlformats.org/drawingml/2006/picture">
+                <pic:pic xmlns:pic="http://schemas.openxmlformats.org/drawingml/2006/picture">
+                  <pic:nvPicPr>
+                    <pic:cNvPr id="398612937" name="Picture 398612937"/>
+                    <pic:cNvPicPr/>
+                  </pic:nvPicPr>
+                  <pic:blipFill>
+                    <a:blip xmlns:r="http://schemas.openxmlformats.org/officeDocument/2006/relationships" r:embed="rId779402756">
+                      <a:extLst>
+                        <a:ext uri="{28A0092B-C50C-407E-A947-70E740481C1C}">
+                          <a14:useLocalDpi xmlns:a14="http://schemas.microsoft.com/office/drawing/2010/main"/>
+                        </a:ext>
+                      </a:extLst>
+                    </a:blip>
+                    <a:stretch>
+                      <a:fillRect/>
+                    </a:stretch>
+                  </pic:blipFill>
+                  <pic:spPr>
+                    <a:xfrm>
+                      <a:off x="0" y="0"/>
+                      <a:ext cx="5724525" cy="3333750"/>
+                    </a:xfrm>
+                    <a:prstGeom prst="rect">
+                      <a:avLst/>
+                    </a:prstGeom>
+                  </pic:spPr>
+                </pic:pic>
+              </a:graphicData>
+            </a:graphic>
+          </wp:inline>
+        </w:drawing>
+      </w:r>
+      <w:r>
+        <w:br/>
+      </w:r>
+    </w:p>
+    <w:p>
+      <w:pPr>
+        <w:pStyle w:val="Normal"/>
+        <w:widowControl w:val="0"/>
+        <w:suppressLineNumbers w:val="0"/>
+        <w:bidi w:val="0"/>
+        <w:spacing w:before="0" w:beforeAutospacing="off" w:after="0" w:afterAutospacing="off" w:line="240" w:lineRule="auto"/>
+        <w:ind w:left="0" w:right="0"/>
+        <w:jc w:val="left"/>
+        <w:rPr>
+          <w:rFonts w:ascii="Arial" w:hAnsi="Arial" w:eastAsia="Arial" w:cs="Arial"/>
+          <w:noProof w:val="0"/>
+          <w:sz w:val="22"/>
+          <w:szCs w:val="22"/>
+          <w:lang w:val="es-ES"/>
+        </w:rPr>
+      </w:pPr>
+    </w:p>
+    <w:p>
+      <w:pPr>
+        <w:pStyle w:val="Normal"/>
+        <w:widowControl w:val="0"/>
+        <w:suppressLineNumbers w:val="0"/>
+        <w:bidi w:val="0"/>
+        <w:spacing w:before="0" w:beforeAutospacing="off" w:after="0" w:afterAutospacing="off" w:line="240" w:lineRule="auto"/>
+        <w:ind w:left="0" w:right="0"/>
+        <w:jc w:val="left"/>
+        <w:rPr>
+          <w:rFonts w:ascii="Arial" w:hAnsi="Arial" w:eastAsia="Arial" w:cs="Arial"/>
+          <w:noProof w:val="0"/>
+          <w:sz w:val="22"/>
+          <w:szCs w:val="22"/>
+          <w:lang w:val="es-ES"/>
+        </w:rPr>
+      </w:pPr>
+    </w:p>
+    <w:p>
+      <w:pPr>
+        <w:pStyle w:val="Normal"/>
+        <w:widowControl w:val="0"/>
+        <w:suppressLineNumbers w:val="0"/>
+        <w:bidi w:val="0"/>
+        <w:spacing w:before="0" w:beforeAutospacing="off" w:after="0" w:afterAutospacing="off" w:line="240" w:lineRule="auto"/>
+        <w:ind w:left="0" w:right="0"/>
+        <w:jc w:val="left"/>
+        <w:rPr>
+          <w:rFonts w:ascii="Arial" w:hAnsi="Arial" w:eastAsia="Arial" w:cs="Arial"/>
+          <w:noProof w:val="0"/>
+          <w:sz w:val="22"/>
+          <w:szCs w:val="22"/>
+          <w:lang w:val="es-ES"/>
+        </w:rPr>
+      </w:pPr>
+    </w:p>
+    <w:p>
+      <w:pPr>
+        <w:pStyle w:val="Normal"/>
+        <w:widowControl w:val="0"/>
+        <w:suppressLineNumbers w:val="0"/>
+        <w:bidi w:val="0"/>
+        <w:spacing w:before="0" w:beforeAutospacing="off" w:after="0" w:afterAutospacing="off" w:line="240" w:lineRule="auto"/>
+        <w:ind w:left="0" w:right="0"/>
+        <w:jc w:val="left"/>
+        <w:rPr>
+          <w:rFonts w:ascii="Arial" w:hAnsi="Arial" w:eastAsia="Arial" w:cs="Arial"/>
+          <w:noProof w:val="0"/>
+          <w:sz w:val="22"/>
+          <w:szCs w:val="22"/>
+          <w:lang w:val="es-ES"/>
+        </w:rPr>
+      </w:pPr>
+    </w:p>
+    <w:p>
+      <w:pPr>
+        <w:pStyle w:val="Normal"/>
+        <w:widowControl w:val="0"/>
+        <w:suppressLineNumbers w:val="0"/>
+        <w:bidi w:val="0"/>
+        <w:spacing w:before="0" w:beforeAutospacing="off" w:after="0" w:afterAutospacing="off" w:line="240" w:lineRule="auto"/>
+        <w:ind w:left="0" w:right="0"/>
+        <w:jc w:val="left"/>
+        <w:rPr>
+          <w:rFonts w:ascii="Arial" w:hAnsi="Arial" w:eastAsia="Arial" w:cs="Arial"/>
+          <w:noProof w:val="0"/>
+          <w:sz w:val="22"/>
+          <w:szCs w:val="22"/>
+          <w:lang w:val="es-ES"/>
+        </w:rPr>
+      </w:pPr>
+    </w:p>
+    <w:p>
+      <w:pPr>
+        <w:pStyle w:val="Normal"/>
+        <w:widowControl w:val="0"/>
+        <w:suppressLineNumbers w:val="0"/>
+        <w:bidi w:val="0"/>
+        <w:spacing w:before="0" w:beforeAutospacing="off" w:after="0" w:afterAutospacing="off" w:line="240" w:lineRule="auto"/>
+        <w:ind w:left="0" w:right="0"/>
+        <w:jc w:val="left"/>
+      </w:pPr>
+      <w:r>
+        <w:rPr>
+          <w:rFonts w:ascii="Arial" w:hAnsi="Arial" w:eastAsia="Arial" w:cs="Arial"/>
+          <w:noProof w:val="0"/>
+          <w:sz w:val="22"/>
+          <w:szCs w:val="22"/>
+          <w:lang w:val="es-ES"/>
+        </w:rPr>
+        <w:t>Parte 10 — Reto adicional</w:t>
+      </w:r>
+    </w:p>
+    <w:p>
+      <w:pPr>
+        <w:pStyle w:val="Normal"/>
+        <w:widowControl w:val="0"/>
+        <w:suppressLineNumbers w:val="0"/>
+        <w:bidi w:val="0"/>
+        <w:spacing w:before="0" w:beforeAutospacing="off" w:after="0" w:afterAutospacing="off" w:line="240" w:lineRule="auto"/>
+        <w:ind w:left="0" w:right="0"/>
+        <w:jc w:val="left"/>
+        <w:rPr>
+          <w:rFonts w:ascii="Arial" w:hAnsi="Arial" w:eastAsia="Arial" w:cs="Arial"/>
+          <w:noProof w:val="0"/>
+          <w:sz w:val="22"/>
+          <w:szCs w:val="22"/>
+          <w:lang w:val="es-ES"/>
+        </w:rPr>
+      </w:pPr>
+    </w:p>
+    <w:p>
+      <w:pPr>
+        <w:pStyle w:val="Normal"/>
+        <w:widowControl w:val="0"/>
+        <w:suppressLineNumbers w:val="0"/>
+        <w:bidi w:val="0"/>
+        <w:spacing w:before="0" w:beforeAutospacing="off" w:after="0" w:afterAutospacing="off" w:line="240" w:lineRule="auto"/>
+        <w:ind w:left="0" w:right="0"/>
+        <w:jc w:val="left"/>
+      </w:pPr>
+      <w:r>
+        <w:rPr>
+          <w:rFonts w:ascii="Arial" w:hAnsi="Arial" w:eastAsia="Arial" w:cs="Arial"/>
+          <w:noProof w:val="0"/>
+          <w:sz w:val="22"/>
+          <w:szCs w:val="22"/>
+          <w:lang w:val="es-ES"/>
+        </w:rPr>
+        <w:t xml:space="preserve">Agregamos </w:t>
+      </w:r>
+      <w:r>
+        <w:rPr>
+          <w:rFonts w:ascii="Arial" w:hAnsi="Arial" w:eastAsia="Arial" w:cs="Arial"/>
+          <w:noProof w:val="0"/>
+          <w:sz w:val="22"/>
+          <w:szCs w:val="22"/>
+          <w:lang w:val="es-ES"/>
+        </w:rPr>
+        <w:t>redis</w:t>
+      </w:r>
+      <w:r>
+        <w:rPr>
+          <w:rFonts w:ascii="Arial" w:hAnsi="Arial" w:eastAsia="Arial" w:cs="Arial"/>
+          <w:noProof w:val="0"/>
+          <w:sz w:val="22"/>
+          <w:szCs w:val="22"/>
+          <w:lang w:val="es-ES"/>
+        </w:rPr>
+        <w:t xml:space="preserve"> dentro de los servicios del compose.yaml</w:t>
+      </w:r>
+    </w:p>
+    <w:p>
+      <w:pPr>
+        <w:pStyle w:val="Normal"/>
+        <w:widowControl w:val="0"/>
+        <w:suppressLineNumbers w:val="0"/>
+        <w:bidi w:val="0"/>
+        <w:spacing w:before="0" w:beforeAutospacing="off" w:after="0" w:afterAutospacing="off" w:line="240" w:lineRule="auto"/>
+        <w:ind w:left="0" w:right="0"/>
+        <w:jc w:val="left"/>
+        <w:rPr>
+          <w:rFonts w:ascii="Arial" w:hAnsi="Arial" w:eastAsia="Arial" w:cs="Arial"/>
+          <w:noProof w:val="0"/>
+          <w:sz w:val="22"/>
+          <w:szCs w:val="22"/>
+          <w:lang w:val="es-ES"/>
+        </w:rPr>
+      </w:pPr>
+    </w:p>
+    <w:p>
+      <w:pPr>
+        <w:pStyle w:val="Normal"/>
+        <w:widowControl w:val="0"/>
+        <w:bidi w:val="0"/>
+        <w:spacing w:before="0" w:beforeAutospacing="off" w:after="0" w:afterAutospacing="off" w:line="240" w:lineRule="auto"/>
+        <w:ind w:left="0" w:right="0"/>
+        <w:jc w:val="left"/>
+        <w:rPr>
+          <w:lang w:val="es-ES"/>
+        </w:rPr>
+      </w:pPr>
+      <w:r>
+        <w:drawing>
+          <wp:inline wp14:editId="2FE4868F" wp14:anchorId="5DE753CC">
+            <wp:extent cx="5724525" cy="4667250"/>
+            <wp:effectExtent l="0" t="0" r="0" b="0"/>
+            <wp:docPr id="844702868" name="drawing"/>
+            <wp:cNvGraphicFramePr>
+              <a:graphicFrameLocks noChangeAspect="1"/>
+            </wp:cNvGraphicFramePr>
+            <a:graphic>
+              <a:graphicData xmlns:a="http://schemas.openxmlformats.org/drawingml/2006/main" uri="http://schemas.openxmlformats.org/drawingml/2006/picture">
+                <pic:pic xmlns:pic="http://schemas.openxmlformats.org/drawingml/2006/picture">
+                  <pic:nvPicPr>
+                    <pic:cNvPr id="844702868" name="Picture 844702868"/>
+                    <pic:cNvPicPr/>
+                  </pic:nvPicPr>
+                  <pic:blipFill>
+                    <a:blip xmlns:r="http://schemas.openxmlformats.org/officeDocument/2006/relationships" r:embed="rId2017630068">
+                      <a:extLst>
+                        <a:ext uri="{28A0092B-C50C-407E-A947-70E740481C1C}">
+                          <a14:useLocalDpi xmlns:a14="http://schemas.microsoft.com/office/drawing/2010/main"/>
+                        </a:ext>
+                      </a:extLst>
+                    </a:blip>
+                    <a:stretch>
+                      <a:fillRect/>
+                    </a:stretch>
+                  </pic:blipFill>
+                  <pic:spPr>
+                    <a:xfrm>
+                      <a:off x="0" y="0"/>
+                      <a:ext cx="5724525" cy="4667250"/>
+                    </a:xfrm>
+                    <a:prstGeom prst="rect">
+                      <a:avLst/>
+                    </a:prstGeom>
+                  </pic:spPr>
+                </pic:pic>
+              </a:graphicData>
+            </a:graphic>
+          </wp:inline>
+        </w:drawing>
+      </w:r>
+      <w:r>
+        <w:br/>
+      </w:r>
+      <w:r>
+        <w:br/>
+      </w:r>
+      <w:r>
+        <w:rPr>
+          <w:lang w:val="es-ES"/>
+        </w:rPr>
+        <w:t>Servicio agregado:</w:t>
+      </w:r>
+      <w:r>
+        <w:br/>
+      </w:r>
+      <w:r>
+        <w:br/>
+      </w:r>
+      <w:r>
+        <w:drawing>
+          <wp:inline wp14:editId="6AFDD081" wp14:anchorId="46ECF712">
+            <wp:extent cx="5724525" cy="1238250"/>
+            <wp:effectExtent l="0" t="0" r="0" b="0"/>
+            <wp:docPr id="1769714548" name="drawing"/>
+            <wp:cNvGraphicFramePr>
+              <a:graphicFrameLocks noChangeAspect="1"/>
+            </wp:cNvGraphicFramePr>
+            <a:graphic>
+              <a:graphicData xmlns:a="http://schemas.openxmlformats.org/drawingml/2006/main" uri="http://schemas.openxmlformats.org/drawingml/2006/picture">
+                <pic:pic xmlns:pic="http://schemas.openxmlformats.org/drawingml/2006/picture">
+                  <pic:nvPicPr>
+                    <pic:cNvPr id="1769714548" name="Picture 1769714548"/>
+                    <pic:cNvPicPr/>
+                  </pic:nvPicPr>
+                  <pic:blipFill>
+                    <a:blip xmlns:r="http://schemas.openxmlformats.org/officeDocument/2006/relationships" r:embed="rId617020580">
+                      <a:extLst>
+                        <a:ext uri="{28A0092B-C50C-407E-A947-70E740481C1C}">
+                          <a14:useLocalDpi xmlns:a14="http://schemas.microsoft.com/office/drawing/2010/main"/>
+                        </a:ext>
+                      </a:extLst>
+                    </a:blip>
+                    <a:stretch>
+                      <a:fillRect/>
+                    </a:stretch>
+                  </pic:blipFill>
+                  <pic:spPr>
+                    <a:xfrm>
+                      <a:off x="0" y="0"/>
+                      <a:ext cx="5724525" cy="1238250"/>
+                    </a:xfrm>
+                    <a:prstGeom prst="rect">
+                      <a:avLst/>
+                    </a:prstGeom>
+                  </pic:spPr>
+                </pic:pic>
+              </a:graphicData>
+            </a:graphic>
+          </wp:inline>
+        </w:drawing>
+      </w:r>
+    </w:p>
+    <w:p>
+      <w:pPr>
+        <w:pStyle w:val="Normal"/>
+        <w:widowControl w:val="0"/>
+        <w:bidi w:val="0"/>
+        <w:spacing w:before="0" w:beforeAutospacing="off" w:after="0" w:afterAutospacing="off" w:line="240" w:lineRule="auto"/>
+        <w:ind w:left="0" w:right="0"/>
+        <w:jc w:val="left"/>
+      </w:pPr>
+    </w:p>
+    <w:p>
+      <w:pPr>
+        <w:pStyle w:val="Normal"/>
+        <w:widowControl w:val="0"/>
+        <w:bidi w:val="0"/>
+        <w:spacing w:before="0" w:beforeAutospacing="off" w:after="0" w:afterAutospacing="off" w:line="240" w:lineRule="auto"/>
+        <w:ind w:left="0" w:right="0"/>
+        <w:jc w:val="left"/>
+      </w:pPr>
+    </w:p>
+    <w:p>
+      <w:pPr>
+        <w:pStyle w:val="Normal"/>
+        <w:widowControl w:val="0"/>
+        <w:bidi w:val="0"/>
+        <w:spacing w:before="0" w:beforeAutospacing="off" w:after="0" w:afterAutospacing="off" w:line="240" w:lineRule="auto"/>
+        <w:ind w:left="0" w:right="0"/>
+        <w:jc w:val="left"/>
+      </w:pPr>
+    </w:p>
+    <w:p>
+      <w:pPr>
+        <w:pStyle w:val="Normal"/>
+        <w:widowControl w:val="0"/>
+        <w:bidi w:val="0"/>
+        <w:spacing w:before="0" w:beforeAutospacing="off" w:after="0" w:afterAutospacing="off" w:line="240" w:lineRule="auto"/>
+        <w:ind w:left="0" w:right="0"/>
+        <w:jc w:val="left"/>
+      </w:pPr>
+    </w:p>
+    <w:p>
+      <w:pPr>
+        <w:pStyle w:val="Normal"/>
+        <w:widowControl w:val="0"/>
+        <w:bidi w:val="0"/>
+        <w:spacing w:before="0" w:beforeAutospacing="off" w:after="0" w:afterAutospacing="off" w:line="240" w:lineRule="auto"/>
+        <w:ind w:left="0" w:right="0"/>
+        <w:jc w:val="left"/>
+      </w:pPr>
+    </w:p>
+    <w:p>
+      <w:pPr>
+        <w:pStyle w:val="Normal"/>
+        <w:widowControl w:val="0"/>
+        <w:bidi w:val="0"/>
+        <w:spacing w:before="0" w:beforeAutospacing="off" w:after="0" w:afterAutospacing="off" w:line="240" w:lineRule="auto"/>
+        <w:ind w:left="0" w:right="0"/>
+        <w:jc w:val="left"/>
+      </w:pPr>
+    </w:p>
+    <w:p>
+      <w:pPr>
+        <w:pStyle w:val="Normal"/>
+        <w:widowControl w:val="0"/>
+        <w:bidi w:val="0"/>
+        <w:spacing w:before="0" w:beforeAutospacing="off" w:after="0" w:afterAutospacing="off" w:line="240" w:lineRule="auto"/>
+        <w:ind w:left="0" w:right="0"/>
+        <w:jc w:val="left"/>
+      </w:pPr>
+    </w:p>
+    <w:p>
+      <w:pPr>
+        <w:pStyle w:val="Normal"/>
+        <w:widowControl w:val="0"/>
+        <w:bidi w:val="0"/>
+        <w:spacing w:before="0" w:beforeAutospacing="off" w:after="0" w:afterAutospacing="off" w:line="240" w:lineRule="auto"/>
+        <w:ind w:left="0" w:right="0"/>
+        <w:jc w:val="left"/>
+      </w:pPr>
+    </w:p>
+    <w:p>
+      <w:pPr>
+        <w:pStyle w:val="Normal"/>
+        <w:widowControl w:val="0"/>
+        <w:bidi w:val="0"/>
+        <w:spacing w:before="0" w:beforeAutospacing="off" w:after="0" w:afterAutospacing="off" w:line="240" w:lineRule="auto"/>
+        <w:ind w:left="0" w:right="0"/>
+        <w:jc w:val="left"/>
+      </w:pPr>
+    </w:p>
+    <w:p>
+      <w:pPr>
+        <w:pStyle w:val="Normal"/>
+        <w:widowControl w:val="0"/>
+        <w:bidi w:val="0"/>
+        <w:spacing w:before="0" w:beforeAutospacing="off" w:after="0" w:afterAutospacing="off" w:line="240" w:lineRule="auto"/>
+        <w:ind w:left="0" w:right="0"/>
+        <w:jc w:val="left"/>
+      </w:pPr>
+      <w:r>
+        <w:br/>
+      </w:r>
+      <w:r>
+        <w:rPr>
+          <w:lang w:val="es-ES"/>
+        </w:rPr>
+        <w:t xml:space="preserve">Aquí podemos ver que recibimos respuesta al hacer la conexión usando el nombre. Sin </w:t>
+      </w:r>
+      <w:r>
+        <w:rPr>
+          <w:lang w:val="es-ES"/>
+        </w:rPr>
+        <w:t>embargo,</w:t>
+      </w:r>
+      <w:r>
+        <w:rPr>
+          <w:lang w:val="es-ES"/>
+        </w:rPr>
+        <w:t xml:space="preserve"> igual que antes, no funciona si utilizamos </w:t>
+      </w:r>
+      <w:r>
+        <w:rPr>
+          <w:lang w:val="es-ES"/>
+        </w:rPr>
+        <w:t>LocalHost</w:t>
+      </w:r>
+      <w:r>
+        <w:rPr>
+          <w:lang w:val="es-ES"/>
+        </w:rPr>
+        <w:t>:</w:t>
+      </w:r>
+    </w:p>
+    <w:p>
+      <w:pPr>
+        <w:pStyle w:val="Normal"/>
+        <w:widowControl w:val="0"/>
+        <w:bidi w:val="0"/>
+        <w:spacing w:before="0" w:beforeAutospacing="off" w:after="0" w:afterAutospacing="off" w:line="240" w:lineRule="auto"/>
+        <w:ind w:left="0" w:right="0"/>
+        <w:jc w:val="left"/>
+      </w:pPr>
+    </w:p>
+    <w:p>
+      <w:pPr>
+        <w:pStyle w:val="Normal"/>
+        <w:widowControl w:val="0"/>
+        <w:bidi w:val="0"/>
+        <w:spacing w:before="0" w:beforeAutospacing="off" w:after="0" w:afterAutospacing="off" w:line="240" w:lineRule="auto"/>
+        <w:ind w:left="0" w:right="0"/>
+        <w:jc w:val="left"/>
+        <w:rPr>
+          <w:lang w:val="es-ES"/>
+        </w:rPr>
+      </w:pPr>
+      <w:r>
+        <w:drawing>
+          <wp:inline wp14:editId="4EE86FAA" wp14:anchorId="21C0D665">
+            <wp:extent cx="5724525" cy="1514475"/>
+            <wp:effectExtent l="0" t="0" r="0" b="0"/>
+            <wp:docPr id="820365331" name="drawing"/>
+            <wp:cNvGraphicFramePr>
+              <a:graphicFrameLocks noChangeAspect="1"/>
+            </wp:cNvGraphicFramePr>
+            <a:graphic>
+              <a:graphicData xmlns:a="http://schemas.openxmlformats.org/drawingml/2006/main" uri="http://schemas.openxmlformats.org/drawingml/2006/picture">
+                <pic:pic xmlns:pic="http://schemas.openxmlformats.org/drawingml/2006/picture">
+                  <pic:nvPicPr>
+                    <pic:cNvPr id="820365331" name="Picture 820365331"/>
+                    <pic:cNvPicPr/>
+                  </pic:nvPicPr>
+                  <pic:blipFill>
+                    <a:blip xmlns:r="http://schemas.openxmlformats.org/officeDocument/2006/relationships" r:embed="rId637328706">
+                      <a:extLst>
+                        <a:ext uri="{28A0092B-C50C-407E-A947-70E740481C1C}">
+                          <a14:useLocalDpi xmlns:a14="http://schemas.microsoft.com/office/drawing/2010/main"/>
+                        </a:ext>
+                      </a:extLst>
+                    </a:blip>
+                    <a:stretch>
+                      <a:fillRect/>
+                    </a:stretch>
+                  </pic:blipFill>
+                  <pic:spPr>
+                    <a:xfrm>
+                      <a:off x="0" y="0"/>
+                      <a:ext cx="5724525" cy="1514475"/>
+                    </a:xfrm>
+                    <a:prstGeom prst="rect">
+                      <a:avLst/>
+                    </a:prstGeom>
+                  </pic:spPr>
+                </pic:pic>
+              </a:graphicData>
+            </a:graphic>
+          </wp:inline>
+        </w:drawing>
+      </w:r>
+    </w:p>
+    <w:p>
+      <w:pPr>
+        <w:pStyle w:val="Normal"/>
+        <w:widowControl w:val="0"/>
+        <w:bidi w:val="0"/>
+        <w:spacing w:before="0" w:beforeAutospacing="off" w:after="0" w:afterAutospacing="off" w:line="240" w:lineRule="auto"/>
+        <w:ind w:left="0" w:right="0"/>
+        <w:jc w:val="left"/>
+        <w:rPr>
+          <w:lang w:val="es-ES"/>
+        </w:rPr>
+      </w:pPr>
+      <w:r>
+        <w:rPr>
+          <w:lang w:val="es-ES"/>
+        </w:rPr>
+        <w:t>Aquí vemos a qué traduce "</w:t>
+      </w:r>
+      <w:r>
+        <w:rPr>
+          <w:lang w:val="es-ES"/>
+        </w:rPr>
+        <w:t>redis</w:t>
+      </w:r>
+      <w:r>
+        <w:rPr>
+          <w:lang w:val="es-ES"/>
+        </w:rPr>
+        <w:t>"- 172.20.0.4</w:t>
+      </w:r>
+    </w:p>
+    <w:p>
+      <w:pPr>
+        <w:pStyle w:val="Normal"/>
+        <w:widowControl w:val="0"/>
+        <w:bidi w:val="0"/>
+        <w:spacing w:before="0" w:beforeAutospacing="off" w:after="0" w:afterAutospacing="off" w:line="240" w:lineRule="auto"/>
+        <w:ind w:left="0" w:right="0"/>
+        <w:jc w:val="left"/>
+      </w:pPr>
+    </w:p>
+    <w:p>
+      <w:pPr>
+        <w:pStyle w:val="Normal"/>
+        <w:widowControl w:val="0"/>
+        <w:bidi w:val="0"/>
+        <w:spacing w:before="0" w:beforeAutospacing="off" w:after="0" w:afterAutospacing="off" w:line="240" w:lineRule="auto"/>
+        <w:ind w:left="0" w:right="0"/>
+        <w:jc w:val="left"/>
+      </w:pPr>
+      <w:r>
+        <w:drawing>
+          <wp:inline wp14:editId="7BEFCE0D" wp14:anchorId="276AE5B8">
+            <wp:extent cx="5724525" cy="1828800"/>
+            <wp:effectExtent l="0" t="0" r="0" b="0"/>
+            <wp:docPr id="209603220" name="drawing"/>
+            <wp:cNvGraphicFramePr>
+              <a:graphicFrameLocks noChangeAspect="1"/>
+            </wp:cNvGraphicFramePr>
+            <a:graphic>
+              <a:graphicData xmlns:a="http://schemas.openxmlformats.org/drawingml/2006/main" uri="http://schemas.openxmlformats.org/drawingml/2006/picture">
+                <pic:pic xmlns:pic="http://schemas.openxmlformats.org/drawingml/2006/picture">
+                  <pic:nvPicPr>
+                    <pic:cNvPr id="209603220" name="Picture 209603220"/>
+                    <pic:cNvPicPr/>
+                  </pic:nvPicPr>
+                  <pic:blipFill>
+                    <a:blip xmlns:r="http://schemas.openxmlformats.org/officeDocument/2006/relationships" r:embed="rId722505467">
+                      <a:extLst>
+                        <a:ext uri="{28A0092B-C50C-407E-A947-70E740481C1C}">
+                          <a14:useLocalDpi xmlns:a14="http://schemas.microsoft.com/office/drawing/2010/main"/>
+                        </a:ext>
+                      </a:extLst>
+                    </a:blip>
+                    <a:stretch>
+                      <a:fillRect/>
+                    </a:stretch>
+                  </pic:blipFill>
+                  <pic:spPr>
+                    <a:xfrm>
+                      <a:off x="0" y="0"/>
+                      <a:ext cx="5724525" cy="1828800"/>
+                    </a:xfrm>
+                    <a:prstGeom prst="rect">
+                      <a:avLst/>
+                    </a:prstGeom>
+                  </pic:spPr>
+                </pic:pic>
+              </a:graphicData>
+            </a:graphic>
+          </wp:inline>
+        </w:drawing>
+      </w:r>
+    </w:p>
+    <w:p>
+      <w:r>
+        <w:br w:type="page"/>
+      </w:r>
+    </w:p>
+    <w:p>
+      <w:pPr>
+        <w:pStyle w:val="Normal"/>
+        <w:widowControl w:val="0"/>
+        <w:bidi w:val="0"/>
+        <w:spacing w:before="0" w:beforeAutospacing="off" w:after="0" w:afterAutospacing="off" w:line="240" w:lineRule="auto"/>
+        <w:ind w:left="0" w:right="0"/>
+        <w:jc w:val="left"/>
+      </w:pPr>
     </w:p>
     <w:sectPr>
-      <w:pgSz w:h="16834" w:w="11909" w:orient="portrait"/>
-      <w:pgMar w:bottom="1440" w:top="1440" w:left="1440" w:right="1440" w:header="720" w:footer="720"/>
+      <w:pgSz w:w="11909" w:h="16834" w:orient="portrait"/>
+      <w:pgMar w:top="1440" w:right="1440" w:bottom="1440" w:left="1440" w:header="720" w:footer="720"/>
       <w:pgNumType w:start="1"/>
+      <w:cols w:num="1"/>
     </w:sectPr>
   </w:body>
 </w:document>
@@ -867,6 +2569,7 @@
         <w:u w:val="none"/>
       </w:rPr>
     </w:lvl>
+    <w:nsid w:val="37d0a191"/>
   </w:abstractNum>
   <w:num w:numId="1">
     <w:abstractNumId w:val="1"/>
@@ -875,11 +2578,11 @@
 </file>
 
 <file path=word/styles.xml><?xml version="1.0" encoding="utf-8"?>
-<w:styles xmlns:mc="http://schemas.openxmlformats.org/markup-compatibility/2006" xmlns:o="urn:schemas-microsoft-com:office:office" xmlns:r="http://schemas.openxmlformats.org/officeDocument/2006/relationships" xmlns:m="http://schemas.openxmlformats.org/officeDocument/2006/math" xmlns:v="urn:schemas-microsoft-com:vml" xmlns:wp="http://schemas.openxmlformats.org/drawingml/2006/wordprocessingDrawing" xmlns:w10="urn:schemas-microsoft-com:office:word" xmlns:w="http://schemas.openxmlformats.org/wordprocessingml/2006/main" xmlns:wne="http://schemas.microsoft.com/office/word/2006/wordml" xmlns:sl="http://schemas.openxmlformats.org/schemaLibrary/2006/main" xmlns:a="http://schemas.openxmlformats.org/drawingml/2006/main" xmlns:pic="http://schemas.openxmlformats.org/drawingml/2006/picture" xmlns:c="http://schemas.openxmlformats.org/drawingml/2006/chart" xmlns:lc="http://schemas.openxmlformats.org/drawingml/2006/lockedCanvas" xmlns:dgm="http://schemas.openxmlformats.org/drawingml/2006/diagram" xmlns:wps="http://schemas.microsoft.com/office/word/2010/wordprocessingShape" xmlns:wpg="http://schemas.microsoft.com/office/word/2010/wordprocessingGroup" xmlns:w14="http://schemas.microsoft.com/office/word/2010/wordml" xmlns:w15="http://schemas.microsoft.com/office/word/2012/wordml" xmlns:w16="http://schemas.microsoft.com/office/word/2018/wordml" xmlns:w16cex="http://schemas.microsoft.com/office/word/2018/wordml/cex" xmlns:w16cid="http://schemas.microsoft.com/office/word/2016/wordml/cid" xmlns="http://schemas.microsoft.com/office/tasks/2019/documenttasks" xmlns:cr="http://schemas.microsoft.com/office/comments/2020/reactions">
+<w:styles xmlns:wp14="http://schemas.microsoft.com/office/word/2010/wordprocessingDrawing" xmlns:mc="http://schemas.openxmlformats.org/markup-compatibility/2006" xmlns:o="urn:schemas-microsoft-com:office:office" xmlns:r="http://schemas.openxmlformats.org/officeDocument/2006/relationships" xmlns:m="http://schemas.openxmlformats.org/officeDocument/2006/math" xmlns:v="urn:schemas-microsoft-com:vml" xmlns:wp="http://schemas.openxmlformats.org/drawingml/2006/wordprocessingDrawing" xmlns:w10="urn:schemas-microsoft-com:office:word" xmlns:w="http://schemas.openxmlformats.org/wordprocessingml/2006/main" xmlns:wne="http://schemas.microsoft.com/office/word/2006/wordml" xmlns:sl="http://schemas.openxmlformats.org/schemaLibrary/2006/main" xmlns:a="http://schemas.openxmlformats.org/drawingml/2006/main" xmlns:pic="http://schemas.openxmlformats.org/drawingml/2006/picture" xmlns:c="http://schemas.openxmlformats.org/drawingml/2006/chart" xmlns:lc="http://schemas.openxmlformats.org/drawingml/2006/lockedCanvas" xmlns:dgm="http://schemas.openxmlformats.org/drawingml/2006/diagram" xmlns:wps="http://schemas.microsoft.com/office/word/2010/wordprocessingShape" xmlns:wpg="http://schemas.microsoft.com/office/word/2010/wordprocessingGroup" xmlns:w14="http://schemas.microsoft.com/office/word/2010/wordml" xmlns:w15="http://schemas.microsoft.com/office/word/2012/wordml" xmlns:w16="http://schemas.microsoft.com/office/word/2018/wordml" xmlns:w16cex="http://schemas.microsoft.com/office/word/2018/wordml/cex" xmlns:w16cid="http://schemas.microsoft.com/office/word/2016/wordml/cid" xmlns="http://schemas.microsoft.com/office/tasks/2019/documenttasks" xmlns:cr="http://schemas.microsoft.com/office/comments/2020/reactions" mc:Ignorable="wp14">
   <w:docDefaults>
     <w:rPrDefault>
       <w:rPr>
-        <w:rFonts w:ascii="Arial" w:cs="Arial" w:eastAsia="Arial" w:hAnsi="Arial"/>
+        <w:rFonts w:ascii="Arial" w:hAnsi="Arial" w:eastAsia="Arial" w:cs="Arial"/>
         <w:sz w:val="22"/>
         <w:szCs w:val="22"/>
         <w:lang w:val="es"/>
@@ -892,7 +2595,7 @@
     </w:pPrDefault>
   </w:docDefaults>
   <w:style w:type="table" w:styleId="TableNormal" w:default="1">
-    <w:name w:val="TableNormal"/>
+    <w:name w:val="Normal Table"/>
     <w:tblPr>
       <w:tblCellMar>
         <w:top w:w="100.0" w:type="dxa"/>
@@ -903,7 +2606,7 @@
     </w:tblPr>
   </w:style>
   <w:style w:type="paragraph" w:styleId="Normal" w:default="1">
-    <w:name w:val="normal"/>
+    <w:name w:val="Normal"/>
   </w:style>
   <w:style w:type="paragraph" w:styleId="Heading1">
     <w:name w:val="heading 1"/>
@@ -913,7 +2616,7 @@
       <w:keepNext w:val="1"/>
       <w:keepLines w:val="1"/>
       <w:pageBreakBefore w:val="0"/>
-      <w:spacing w:after="120" w:before="400" w:lineRule="auto"/>
+      <w:spacing w:before="400" w:after="120" w:lineRule="auto"/>
     </w:pPr>
     <w:rPr>
       <w:sz w:val="40"/>
@@ -928,7 +2631,7 @@
       <w:keepNext w:val="1"/>
       <w:keepLines w:val="1"/>
       <w:pageBreakBefore w:val="0"/>
-      <w:spacing w:after="120" w:before="360" w:lineRule="auto"/>
+      <w:spacing w:before="360" w:after="120" w:lineRule="auto"/>
     </w:pPr>
     <w:rPr>
       <w:b w:val="0"/>
@@ -945,7 +2648,7 @@
       <w:keepNext w:val="1"/>
       <w:keepLines w:val="1"/>
       <w:pageBreakBefore w:val="0"/>
-      <w:spacing w:after="80" w:before="320" w:lineRule="auto"/>
+      <w:spacing w:before="320" w:after="80" w:lineRule="auto"/>
     </w:pPr>
     <w:rPr>
       <w:b w:val="0"/>
@@ -963,7 +2666,7 @@
       <w:keepNext w:val="1"/>
       <w:keepLines w:val="1"/>
       <w:pageBreakBefore w:val="0"/>
-      <w:spacing w:after="80" w:before="280" w:lineRule="auto"/>
+      <w:spacing w:before="280" w:after="80" w:lineRule="auto"/>
     </w:pPr>
     <w:rPr>
       <w:color w:val="666666"/>
@@ -979,7 +2682,7 @@
       <w:keepNext w:val="1"/>
       <w:keepLines w:val="1"/>
       <w:pageBreakBefore w:val="0"/>
-      <w:spacing w:after="80" w:before="240" w:lineRule="auto"/>
+      <w:spacing w:before="240" w:after="80" w:lineRule="auto"/>
     </w:pPr>
     <w:rPr>
       <w:color w:val="666666"/>
@@ -995,7 +2698,7 @@
       <w:keepNext w:val="1"/>
       <w:keepLines w:val="1"/>
       <w:pageBreakBefore w:val="0"/>
-      <w:spacing w:after="80" w:before="240" w:lineRule="auto"/>
+      <w:spacing w:before="240" w:after="80" w:lineRule="auto"/>
     </w:pPr>
     <w:rPr>
       <w:i w:val="1"/>
@@ -1013,7 +2716,7 @@
       <w:keepNext w:val="1"/>
       <w:keepLines w:val="1"/>
       <w:pageBreakBefore w:val="0"/>
-      <w:spacing w:after="60" w:before="0" w:lineRule="auto"/>
+      <w:spacing w:before="0" w:after="60" w:lineRule="auto"/>
     </w:pPr>
     <w:rPr>
       <w:sz w:val="52"/>
@@ -1028,10 +2731,10 @@
       <w:keepNext w:val="1"/>
       <w:keepLines w:val="1"/>
       <w:pageBreakBefore w:val="0"/>
-      <w:spacing w:after="320" w:before="0" w:lineRule="auto"/>
+      <w:spacing w:before="0" w:after="320" w:lineRule="auto"/>
     </w:pPr>
     <w:rPr>
-      <w:rFonts w:ascii="Arial" w:cs="Arial" w:eastAsia="Arial" w:hAnsi="Arial"/>
+      <w:rFonts w:ascii="Arial" w:hAnsi="Arial" w:eastAsia="Arial" w:cs="Arial"/>
       <w:i w:val="0"/>
       <w:iCs w:val="0"/>
       <w:color w:val="666666"/>

</xml_diff>